<commit_message>
Remove identifying files from repo; sync rendered outputs
Move name-bearing manuscript exports (cover letter/page already out) to a
private location outside the repo; re-render anonymized manuscript and
supplement; drop stale dated supplement docx.

Co-Authored-By: Claude Opus 4.8 <noreply@anthropic.com>
</commit_message>
<xml_diff>
--- a/6. Writing & Presentations/OMIT_manuscript_rendered.docx
+++ b/6. Writing & Presentations/OMIT_manuscript_rendered.docx
@@ -323,7 +323,7 @@
         <w:t xml:space="preserve"> </w:t>
       </w:r>
       <w:r>
-        <w:t xml:space="preserve">distinction seems to be made as early as 4 months: infants expect that</w:t>
+        <w:t xml:space="preserve">distinction seems to be made as early as 8 months: infants expect that</w:t>
       </w:r>
       <w:r>
         <w:t xml:space="preserve"> </w:t>
@@ -335,41 +335,28 @@
         <w:t xml:space="preserve"> </w:t>
       </w:r>
       <w:r>
-        <w:t xml:space="preserve">(Thomas et al., 2022</w:t>
-      </w:r>
-      <w:r>
-        <w:t xml:space="preserve"> </w:t>
-      </w:r>
-      <w:r>
-        <w:rPr>
-          <w:b/>
-          <w:bCs/>
-        </w:rPr>
-        <w:t xml:space="preserve">; Woo et al., under review</w:t>
-      </w:r>
-      <w:r>
-        <w:t xml:space="preserve">)</w:t>
-      </w:r>
-      <w:r>
-        <w:t xml:space="preserve">. One hallmark of such</w:t>
-      </w:r>
-      <w:r>
-        <w:t xml:space="preserve"> </w:t>
-      </w:r>
-      <w:r>
-        <w:t xml:space="preserve">relationships is emotional intimacy, which includes disclosing personal</w:t>
-      </w:r>
-      <w:r>
-        <w:t xml:space="preserve"> </w:t>
-      </w:r>
-      <w:r>
-        <w:t xml:space="preserve">information. Emotional intimacy has been studied across several</w:t>
-      </w:r>
-      <w:r>
-        <w:t xml:space="preserve"> </w:t>
-      </w:r>
-      <w:r>
-        <w:t xml:space="preserve">disciplines, such as Anthropology, Relationship Science</w:t>
+        <w:t xml:space="preserve">(Thomas et al., 2022)</w:t>
+      </w:r>
+      <w:r>
+        <w:t xml:space="preserve">. One hallmark of such relationships is emotional</w:t>
+      </w:r>
+      <w:r>
+        <w:t xml:space="preserve"> </w:t>
+      </w:r>
+      <w:r>
+        <w:t xml:space="preserve">intimacy, which includes disclosing personal information. Emotional</w:t>
+      </w:r>
+      <w:r>
+        <w:t xml:space="preserve"> </w:t>
+      </w:r>
+      <w:r>
+        <w:t xml:space="preserve">intimacy has been studied across several disciplines, such as</w:t>
+      </w:r>
+      <w:r>
+        <w:t xml:space="preserve"> </w:t>
+      </w:r>
+      <w:r>
+        <w:t xml:space="preserve">Anthropology, Relationship Science</w:t>
       </w:r>
       <w:r>
         <w:t xml:space="preserve"> </w:t>
@@ -378,19 +365,19 @@
         <w:t xml:space="preserve">(Finkenauer &amp; Buyukcan-Tetik, 2015; Willems et al., 2020)</w:t>
       </w:r>
       <w:r>
-        <w:t xml:space="preserve">, and Sociology. Sociologists</w:t>
-      </w:r>
-      <w:r>
-        <w:t xml:space="preserve"> </w:t>
-      </w:r>
-      <w:r>
-        <w:t xml:space="preserve">have long characterized relationships by the kind of information</w:t>
-      </w:r>
-      <w:r>
-        <w:t xml:space="preserve"> </w:t>
-      </w:r>
-      <w:r>
-        <w:t xml:space="preserve">disclosed within them. More than a century ago,</w:t>
+        <w:t xml:space="preserve">, and Sociology. Sociologists have long characterized</w:t>
+      </w:r>
+      <w:r>
+        <w:t xml:space="preserve"> </w:t>
+      </w:r>
+      <w:r>
+        <w:t xml:space="preserve">relationships by the kind of information disclosed within them. More</w:t>
+      </w:r>
+      <w:r>
+        <w:t xml:space="preserve"> </w:t>
+      </w:r>
+      <w:r>
+        <w:t xml:space="preserve">than a century ago,</w:t>
       </w:r>
       <w:r>
         <w:t xml:space="preserve"> </w:t>
@@ -402,55 +389,61 @@
         <w:t xml:space="preserve"> </w:t>
       </w:r>
       <w:r>
-        <w:t xml:space="preserve">argued that what and how much people reveal to one another is calibrated</w:t>
-      </w:r>
-      <w:r>
-        <w:t xml:space="preserve"> </w:t>
-      </w:r>
-      <w:r>
-        <w:t xml:space="preserve">to the closeness of the relationship: acquaintances share outward,</w:t>
-      </w:r>
-      <w:r>
-        <w:t xml:space="preserve"> </w:t>
-      </w:r>
-      <w:r>
-        <w:t xml:space="preserve">impersonal facts, whereas intimate bonds rest on the disclosure of one’s</w:t>
-      </w:r>
-      <w:r>
-        <w:t xml:space="preserve"> </w:t>
-      </w:r>
-      <w:r>
-        <w:t xml:space="preserve">inner life, including emotions. Contemporary network research</w:t>
-      </w:r>
-      <w:r>
-        <w:t xml:space="preserve"> </w:t>
-      </w:r>
-      <w:r>
-        <w:t xml:space="preserve">operationalizes a version of this idea through the kinds of ties people</w:t>
-      </w:r>
-      <w:r>
-        <w:t xml:space="preserve"> </w:t>
-      </w:r>
-      <w:r>
-        <w:t xml:space="preserve">report—weak ties are those to whom one turns for useful information,</w:t>
-      </w:r>
-      <w:r>
-        <w:t xml:space="preserve"> </w:t>
-      </w:r>
-      <w:r>
-        <w:t xml:space="preserve">while thick ties are those to whom one discloses sensitive or personal</w:t>
-      </w:r>
-      <w:r>
-        <w:t xml:space="preserve"> </w:t>
-      </w:r>
-      <w:r>
-        <w:t xml:space="preserve">matters</w:t>
-      </w:r>
-      <w:r>
-        <w:t xml:space="preserve"> </w:t>
-      </w:r>
-      <w:r>
-        <w:t xml:space="preserve">(refer to Small, 2017, for a history)</w:t>
+        <w:t xml:space="preserve">argued that what and how much</w:t>
+      </w:r>
+      <w:r>
+        <w:t xml:space="preserve"> </w:t>
+      </w:r>
+      <w:r>
+        <w:t xml:space="preserve">people reveal to one another is calibrated to the closeness of the</w:t>
+      </w:r>
+      <w:r>
+        <w:t xml:space="preserve"> </w:t>
+      </w:r>
+      <w:r>
+        <w:t xml:space="preserve">relationship: acquaintances share outward, impersonal facts, whereas</w:t>
+      </w:r>
+      <w:r>
+        <w:t xml:space="preserve"> </w:t>
+      </w:r>
+      <w:r>
+        <w:t xml:space="preserve">intimate bonds rest on the disclosure of one’s inner life, including</w:t>
+      </w:r>
+      <w:r>
+        <w:t xml:space="preserve"> </w:t>
+      </w:r>
+      <w:r>
+        <w:t xml:space="preserve">emotions. Contemporary network research operationalizes a version of</w:t>
+      </w:r>
+      <w:r>
+        <w:t xml:space="preserve"> </w:t>
+      </w:r>
+      <w:r>
+        <w:t xml:space="preserve">this idea through the kinds of ties people report—weak ties are those</w:t>
+      </w:r>
+      <w:r>
+        <w:t xml:space="preserve"> </w:t>
+      </w:r>
+      <w:r>
+        <w:t xml:space="preserve">to whom one turns for useful information, while thick ties are those to</w:t>
+      </w:r>
+      <w:r>
+        <w:t xml:space="preserve"> </w:t>
+      </w:r>
+      <w:r>
+        <w:t xml:space="preserve">whom one discloses sensitive or personal matters</w:t>
+      </w:r>
+      <w:r>
+        <w:t xml:space="preserve"> </w:t>
+      </w:r>
+      <w:r>
+        <w:t xml:space="preserve">(refer to Small, 2017,</w:t>
+      </w:r>
+      <w:r>
+        <w:t xml:space="preserve"> </w:t>
+      </w:r>
+      <w:r>
+        <w:t xml:space="preserve">for a history)</w:t>
       </w:r>
       <w:r>
         <w:t xml:space="preserve">.</w:t>
@@ -4841,130 +4834,115 @@
         <w:t xml:space="preserve"> </w:t>
       </w:r>
       <w:r>
-        <w:t xml:space="preserve">caregiving: the mother is ordinarily the one who comforts a child</w:t>
-      </w:r>
-      <w:r>
-        <w:t xml:space="preserve"> </w:t>
-      </w:r>
-      <w:r>
-        <w:t xml:space="preserve">(though see</w:t>
-      </w:r>
-      <w:r>
-        <w:t xml:space="preserve"> </w:t>
-      </w:r>
-      <w:r>
-        <w:t xml:space="preserve">Steele &amp; Thomas (in press)</w:t>
-      </w:r>
-      <w:r>
-        <w:t xml:space="preserve">, for potential evidence that younger children</w:t>
-      </w:r>
-      <w:r>
-        <w:t xml:space="preserve"> </w:t>
-      </w:r>
-      <w:r>
-        <w:t xml:space="preserve">do not share this intuition), not the reverse. In Study 4 we examined</w:t>
-      </w:r>
-      <w:r>
-        <w:t xml:space="preserve"> </w:t>
-      </w:r>
-      <w:r>
-        <w:t xml:space="preserve">emotional disclosure in this asymmetric relationship from both</w:t>
-      </w:r>
-      <w:r>
-        <w:t xml:space="preserve"> </w:t>
-      </w:r>
-      <w:r>
-        <w:t xml:space="preserve">directions. In Study 4.A, we asked whether children expect a child to</w:t>
-      </w:r>
-      <w:r>
-        <w:t xml:space="preserve"> </w:t>
-      </w:r>
-      <w:r>
-        <w:t xml:space="preserve">disclose sad emotions to their own mother, a close relationship, but not</w:t>
-      </w:r>
-      <w:r>
-        <w:t xml:space="preserve"> </w:t>
-      </w:r>
-      <w:r>
-        <w:t xml:space="preserve">to a friend’s mother, a more distant relationship. This comparison tests</w:t>
-      </w:r>
-      <w:r>
-        <w:t xml:space="preserve"> </w:t>
-      </w:r>
-      <w:r>
-        <w:t xml:space="preserve">whether children expect emotional disclosure within close relationships,</w:t>
-      </w:r>
-      <w:r>
-        <w:t xml:space="preserve"> </w:t>
-      </w:r>
-      <w:r>
-        <w:t xml:space="preserve">but it leaves open whether they treat emotional disclosure as a</w:t>
-      </w:r>
-      <w:r>
-        <w:t xml:space="preserve"> </w:t>
-      </w:r>
-      <w:r>
-        <w:t xml:space="preserve">symmetric feature of closeness, something both partners do or as</w:t>
-      </w:r>
-      <w:r>
-        <w:t xml:space="preserve"> </w:t>
-      </w:r>
-      <w:r>
-        <w:t xml:space="preserve">something that can also align with the caregiving structure of a</w:t>
-      </w:r>
-      <w:r>
-        <w:t xml:space="preserve"> </w:t>
-      </w:r>
-      <w:r>
-        <w:t xml:space="preserve">relationship. In Study 4.B we therefore tested the reverse direction:</w:t>
-      </w:r>
-      <w:r>
-        <w:t xml:space="preserve"> </w:t>
-      </w:r>
-      <w:r>
-        <w:t xml:space="preserve">whether children expect a mother to disclose her own sadness to her</w:t>
-      </w:r>
-      <w:r>
-        <w:t xml:space="preserve"> </w:t>
-      </w:r>
-      <w:r>
-        <w:t xml:space="preserve">child. If children expect emotional disclosure simply because a</w:t>
-      </w:r>
-      <w:r>
-        <w:t xml:space="preserve"> </w:t>
-      </w:r>
-      <w:r>
-        <w:t xml:space="preserve">relationship is close, they should expect a mother to disclose her</w:t>
-      </w:r>
-      <w:r>
-        <w:t xml:space="preserve"> </w:t>
-      </w:r>
-      <w:r>
-        <w:t xml:space="preserve">sadness to her child, just as they expect a child to disclose to a</w:t>
-      </w:r>
-      <w:r>
-        <w:t xml:space="preserve"> </w:t>
-      </w:r>
-      <w:r>
-        <w:t xml:space="preserve">mother. If instead children intuit that a mother disclosing sadness</w:t>
-      </w:r>
-      <w:r>
-        <w:t xml:space="preserve"> </w:t>
-      </w:r>
-      <w:r>
-        <w:t xml:space="preserve">would imply that her young child ought to comfort her, inverting their</w:t>
-      </w:r>
-      <w:r>
-        <w:t xml:space="preserve"> </w:t>
-      </w:r>
-      <w:r>
-        <w:t xml:space="preserve">roles, they should be less inclined to expect that a mother will share</w:t>
-      </w:r>
-      <w:r>
-        <w:t xml:space="preserve"> </w:t>
-      </w:r>
-      <w:r>
-        <w:t xml:space="preserve">her sad emotion, even though the relationship is close.</w:t>
+        <w:t xml:space="preserve">caregiving: the mother is ordinarily the one who comforts a child, not</w:t>
+      </w:r>
+      <w:r>
+        <w:t xml:space="preserve"> </w:t>
+      </w:r>
+      <w:r>
+        <w:t xml:space="preserve">the reverse. In Study 4 we examined emotional disclosure in this</w:t>
+      </w:r>
+      <w:r>
+        <w:t xml:space="preserve"> </w:t>
+      </w:r>
+      <w:r>
+        <w:t xml:space="preserve">asymmetric relationship from both directions. In Study 4.A, we asked</w:t>
+      </w:r>
+      <w:r>
+        <w:t xml:space="preserve"> </w:t>
+      </w:r>
+      <w:r>
+        <w:t xml:space="preserve">whether children expect a child to disclose sad emotions to their own</w:t>
+      </w:r>
+      <w:r>
+        <w:t xml:space="preserve"> </w:t>
+      </w:r>
+      <w:r>
+        <w:t xml:space="preserve">mother, a close relationship, but not to a friend’s mother, a more</w:t>
+      </w:r>
+      <w:r>
+        <w:t xml:space="preserve"> </w:t>
+      </w:r>
+      <w:r>
+        <w:t xml:space="preserve">distant relationship. This comparison tests whether children expect</w:t>
+      </w:r>
+      <w:r>
+        <w:t xml:space="preserve"> </w:t>
+      </w:r>
+      <w:r>
+        <w:t xml:space="preserve">emotional disclosure within close relationships, but it leaves open</w:t>
+      </w:r>
+      <w:r>
+        <w:t xml:space="preserve"> </w:t>
+      </w:r>
+      <w:r>
+        <w:t xml:space="preserve">whether they treat emotional disclosure as a symmetric feature of</w:t>
+      </w:r>
+      <w:r>
+        <w:t xml:space="preserve"> </w:t>
+      </w:r>
+      <w:r>
+        <w:t xml:space="preserve">closeness, something both partners do or as something that can also</w:t>
+      </w:r>
+      <w:r>
+        <w:t xml:space="preserve"> </w:t>
+      </w:r>
+      <w:r>
+        <w:t xml:space="preserve">align with the caregiving structure of a relationship. In Study 4.B we</w:t>
+      </w:r>
+      <w:r>
+        <w:t xml:space="preserve"> </w:t>
+      </w:r>
+      <w:r>
+        <w:t xml:space="preserve">therefore tested the reverse direction: whether children expect a mother</w:t>
+      </w:r>
+      <w:r>
+        <w:t xml:space="preserve"> </w:t>
+      </w:r>
+      <w:r>
+        <w:t xml:space="preserve">to disclose her own sadness to her child. If children expect emotional</w:t>
+      </w:r>
+      <w:r>
+        <w:t xml:space="preserve"> </w:t>
+      </w:r>
+      <w:r>
+        <w:t xml:space="preserve">disclosure simply because a relationship is close, they should expect a</w:t>
+      </w:r>
+      <w:r>
+        <w:t xml:space="preserve"> </w:t>
+      </w:r>
+      <w:r>
+        <w:t xml:space="preserve">mother to disclose her sadness to her child, just as they expect a child</w:t>
+      </w:r>
+      <w:r>
+        <w:t xml:space="preserve"> </w:t>
+      </w:r>
+      <w:r>
+        <w:t xml:space="preserve">to disclose to a mother. If instead children intuit that a mother</w:t>
+      </w:r>
+      <w:r>
+        <w:t xml:space="preserve"> </w:t>
+      </w:r>
+      <w:r>
+        <w:t xml:space="preserve">disclosing sadness would imply that her young child ought to comfort</w:t>
+      </w:r>
+      <w:r>
+        <w:t xml:space="preserve"> </w:t>
+      </w:r>
+      <w:r>
+        <w:t xml:space="preserve">her, inverting their roles, they should be less inclined to expect that</w:t>
+      </w:r>
+      <w:r>
+        <w:t xml:space="preserve"> </w:t>
+      </w:r>
+      <w:r>
+        <w:t xml:space="preserve">a mother will share her sad emotion, even though the relationship is</w:t>
+      </w:r>
+      <w:r>
+        <w:t xml:space="preserve"> </w:t>
+      </w:r>
+      <w:r>
+        <w:t xml:space="preserve">close.</w:t>
       </w:r>
     </w:p>
     <w:bookmarkStart w:id="52" w:name="study-4.a"/>
@@ -7462,13 +7440,13 @@
         <w:t xml:space="preserve"> </w:t>
       </w:r>
       <w:r>
-        <w:t xml:space="preserve">anonymous review]), and all data, analysis code, and study materials are</w:t>
-      </w:r>
-      <w:r>
-        <w:t xml:space="preserve"> </w:t>
-      </w:r>
-      <w:r>
-        <w:t xml:space="preserve">available at [anonymized repository link].</w:t>
+        <w:t xml:space="preserve">anonymous review]), and all data, analysis code, and study materials</w:t>
+      </w:r>
+      <w:r>
+        <w:t xml:space="preserve"> </w:t>
+      </w:r>
+      <w:r>
+        <w:t xml:space="preserve">are available at [anonymized repository link].</w:t>
       </w:r>
     </w:p>
     <w:p>
@@ -7488,7 +7466,7 @@
       </w:r>
     </w:p>
     <w:bookmarkEnd w:id="63"/>
-    <w:bookmarkStart w:id="116" w:name="references"/>
+    <w:bookmarkStart w:id="115" w:name="references"/>
     <w:p>
       <w:pPr>
         <w:pStyle w:val="Heading1"/>
@@ -7497,7 +7475,7 @@
         <w:t xml:space="preserve">References</w:t>
       </w:r>
     </w:p>
-    <w:bookmarkStart w:id="115" w:name="refs"/>
+    <w:bookmarkStart w:id="114" w:name="refs"/>
     <w:bookmarkStart w:id="65" w:name="ref-afshordi2021"/>
     <w:p>
       <w:pPr>
@@ -8396,30 +8374,7 @@
       </w:hyperlink>
     </w:p>
     <w:bookmarkEnd w:id="100"/>
-    <w:bookmarkStart w:id="101" w:name="ref-steeleinpress"/>
-    <w:p>
-      <w:pPr>
-        <w:pStyle w:val="Bibliography"/>
-      </w:pPr>
-      <w:r>
-        <w:t xml:space="preserve">Steele, C. M., &amp; Thomas, A. J. (in press). Early concepts of caregiving: Do children recognize caregivers in third-party interactions?</w:t>
-      </w:r>
-      <w:r>
-        <w:t xml:space="preserve"> </w:t>
-      </w:r>
-      <w:r>
-        <w:rPr>
-          <w:i/>
-          <w:iCs/>
-        </w:rPr>
-        <w:t xml:space="preserve">Proceedings of the Annual Meeting of the Cognitive Science Society</w:t>
-      </w:r>
-      <w:r>
-        <w:t xml:space="preserve">.</w:t>
-      </w:r>
-    </w:p>
-    <w:bookmarkEnd w:id="101"/>
-    <w:bookmarkStart w:id="103" w:name="ref-thomas2024"/>
+    <w:bookmarkStart w:id="102" w:name="ref-thomas2024"/>
     <w:p>
       <w:pPr>
         <w:pStyle w:val="Bibliography"/>
@@ -8443,7 +8398,7 @@
       <w:r>
         <w:t xml:space="preserve"> </w:t>
       </w:r>
-      <w:hyperlink r:id="rId102">
+      <w:hyperlink r:id="rId101">
         <w:r>
           <w:rPr>
             <w:rStyle w:val="Hyperlink"/>
@@ -8452,8 +8407,8 @@
         </w:r>
       </w:hyperlink>
     </w:p>
-    <w:bookmarkEnd w:id="103"/>
-    <w:bookmarkStart w:id="104" w:name="ref-thomas2025caregiving"/>
+    <w:bookmarkEnd w:id="102"/>
+    <w:bookmarkStart w:id="103" w:name="ref-thomas2025caregiving"/>
     <w:p>
       <w:pPr>
         <w:pStyle w:val="Bibliography"/>
@@ -8488,8 +8443,8 @@
         <w:t xml:space="preserve">(1), 14–35.</w:t>
       </w:r>
     </w:p>
-    <w:bookmarkEnd w:id="104"/>
-    <w:bookmarkStart w:id="106" w:name="ref-thomasSaliva2022"/>
+    <w:bookmarkEnd w:id="103"/>
+    <w:bookmarkStart w:id="105" w:name="ref-thomasSaliva2022"/>
     <w:p>
       <w:pPr>
         <w:pStyle w:val="Bibliography"/>
@@ -8526,7 +8481,7 @@
       <w:r>
         <w:t xml:space="preserve"> </w:t>
       </w:r>
-      <w:hyperlink r:id="rId105">
+      <w:hyperlink r:id="rId104">
         <w:r>
           <w:rPr>
             <w:rStyle w:val="Hyperlink"/>
@@ -8535,8 +8490,8 @@
         </w:r>
       </w:hyperlink>
     </w:p>
-    <w:bookmarkEnd w:id="106"/>
-    <w:bookmarkStart w:id="108" w:name="ref-thomsen2020"/>
+    <w:bookmarkEnd w:id="105"/>
+    <w:bookmarkStart w:id="107" w:name="ref-thomsen2020"/>
     <w:p>
       <w:pPr>
         <w:pStyle w:val="Bibliography"/>
@@ -8573,7 +8528,7 @@
       <w:r>
         <w:t xml:space="preserve"> </w:t>
       </w:r>
-      <w:hyperlink r:id="rId107">
+      <w:hyperlink r:id="rId106">
         <w:r>
           <w:rPr>
             <w:rStyle w:val="Hyperlink"/>
@@ -8582,8 +8537,8 @@
         </w:r>
       </w:hyperlink>
     </w:p>
-    <w:bookmarkEnd w:id="108"/>
-    <w:bookmarkStart w:id="110" w:name="ref-vijayakumar2020"/>
+    <w:bookmarkEnd w:id="107"/>
+    <w:bookmarkStart w:id="109" w:name="ref-vijayakumar2020"/>
     <w:p>
       <w:pPr>
         <w:pStyle w:val="Bibliography"/>
@@ -8620,7 +8575,7 @@
       <w:r>
         <w:t xml:space="preserve"> </w:t>
       </w:r>
-      <w:hyperlink r:id="rId109">
+      <w:hyperlink r:id="rId108">
         <w:r>
           <w:rPr>
             <w:rStyle w:val="Hyperlink"/>
@@ -8629,8 +8584,8 @@
         </w:r>
       </w:hyperlink>
     </w:p>
-    <w:bookmarkEnd w:id="110"/>
-    <w:bookmarkStart w:id="111" w:name="ref-wellman2015"/>
+    <w:bookmarkEnd w:id="109"/>
+    <w:bookmarkStart w:id="110" w:name="ref-wellman2015"/>
     <w:p>
       <w:pPr>
         <w:pStyle w:val="Bibliography"/>
@@ -8652,8 +8607,8 @@
         <w:t xml:space="preserve">. Oxford University Press.</w:t>
       </w:r>
     </w:p>
-    <w:bookmarkEnd w:id="111"/>
-    <w:bookmarkStart w:id="112" w:name="ref-willems2020role"/>
+    <w:bookmarkEnd w:id="110"/>
+    <w:bookmarkStart w:id="111" w:name="ref-willems2020role"/>
     <w:p>
       <w:pPr>
         <w:pStyle w:val="Bibliography"/>
@@ -8688,8 +8643,8 @@
         <w:t xml:space="preserve">, 33–37.</w:t>
       </w:r>
     </w:p>
-    <w:bookmarkEnd w:id="112"/>
-    <w:bookmarkStart w:id="114" w:name="ref-woo2024"/>
+    <w:bookmarkEnd w:id="111"/>
+    <w:bookmarkStart w:id="113" w:name="ref-woo2024"/>
     <w:p>
       <w:pPr>
         <w:pStyle w:val="Bibliography"/>
@@ -8726,7 +8681,7 @@
       <w:r>
         <w:t xml:space="preserve"> </w:t>
       </w:r>
-      <w:hyperlink r:id="rId113">
+      <w:hyperlink r:id="rId112">
         <w:r>
           <w:rPr>
             <w:rStyle w:val="Hyperlink"/>
@@ -8735,9 +8690,9 @@
         </w:r>
       </w:hyperlink>
     </w:p>
+    <w:bookmarkEnd w:id="113"/>
     <w:bookmarkEnd w:id="114"/>
     <w:bookmarkEnd w:id="115"/>
-    <w:bookmarkEnd w:id="116"/>
     <w:sectPr>
       <w:footnotePr>
         <w:numRestart w:val="eachSect"/>

</xml_diff>

<commit_message>
Add anonymized data/materials repository link (OMIT-74BB)
Co-Authored-By: Claude Opus 4.8 <noreply@anthropic.com>
</commit_message>
<xml_diff>
--- a/6. Writing & Presentations/OMIT_manuscript_rendered.docx
+++ b/6. Writing & Presentations/OMIT_manuscript_rendered.docx
@@ -7,7 +7,7 @@
         <w:pStyle w:val="Title"/>
       </w:pPr>
       <w:r>
-        <w:t xml:space="preserve">Children’s Expectations of Emotional Intimacy in Close Relationships</w:t>
+        <w:t xml:space="preserve">Expectations of Emotional Intimacy in Close Relationships in Children and Adults</w:t>
       </w:r>
     </w:p>
     <w:p>
@@ -23,7 +23,7 @@
         <w:pStyle w:val="Date"/>
       </w:pPr>
       <w:r>
-        <w:t xml:space="preserve">2026-06-30</w:t>
+        <w:t xml:space="preserve">2026-07-01</w:t>
       </w:r>
     </w:p>
     <w:p>
@@ -1503,7 +1503,7 @@
     </w:tbl>
     <w:bookmarkEnd w:id="15"/>
     <w:bookmarkEnd w:id="16"/>
-    <w:bookmarkStart w:id="20" w:name="general-methods"/>
+    <w:bookmarkStart w:id="21" w:name="general-methods"/>
     <w:p>
       <w:pPr>
         <w:pStyle w:val="Heading1"/>
@@ -1512,7 +1512,7 @@
         <w:t xml:space="preserve">General Methods</w:t>
       </w:r>
     </w:p>
-    <w:bookmarkStart w:id="19" w:name="participants"/>
+    <w:bookmarkStart w:id="20" w:name="participants"/>
     <w:p>
       <w:pPr>
         <w:pStyle w:val="Heading2"/>
@@ -2016,24 +2016,38 @@
         <w:t xml:space="preserve"> </w:t>
       </w:r>
       <w:r>
-        <w:t xml:space="preserve">analysis code, and study materials are available on the Open Science</w:t>
-      </w:r>
-      <w:r>
-        <w:t xml:space="preserve"> </w:t>
-      </w:r>
-      <w:r>
-        <w:t xml:space="preserve">Framework at [OSF PROJECT URL]; the pre-registrations are linked</w:t>
-      </w:r>
-      <w:r>
-        <w:t xml:space="preserve"> </w:t>
-      </w:r>
-      <w:r>
-        <w:t xml:space="preserve">above.</w:t>
-      </w:r>
-    </w:p>
-    <w:bookmarkEnd w:id="19"/>
+        <w:t xml:space="preserve">analysis code, and study materials are available at</w:t>
+      </w:r>
+      <w:r>
+        <w:t xml:space="preserve"> </w:t>
+      </w:r>
+      <w:hyperlink r:id="rId19">
+        <w:r>
+          <w:rPr>
+            <w:rStyle w:val="Hyperlink"/>
+          </w:rPr>
+          <w:t xml:space="preserve">https://anonymous.4open.science/r/OMIT-74BB/</w:t>
+        </w:r>
+      </w:hyperlink>
+      <w:r>
+        <w:t xml:space="preserve">. The studies’ designs and</w:t>
+      </w:r>
+      <w:r>
+        <w:t xml:space="preserve"> </w:t>
+      </w:r>
+      <w:r>
+        <w:t xml:space="preserve">primary analyses were pre-registered (pre-registration links removed for</w:t>
+      </w:r>
+      <w:r>
+        <w:t xml:space="preserve"> </w:t>
+      </w:r>
+      <w:r>
+        <w:t xml:space="preserve">anonymous review).</w:t>
+      </w:r>
+    </w:p>
     <w:bookmarkEnd w:id="20"/>
-    <w:bookmarkStart w:id="27" w:name="Xbe7495882fc6f1d665f895abf29a8ef09e8aafe"/>
+    <w:bookmarkEnd w:id="21"/>
+    <w:bookmarkStart w:id="28" w:name="Xbe7495882fc6f1d665f895abf29a8ef09e8aafe"/>
     <w:p>
       <w:pPr>
         <w:pStyle w:val="Heading1"/>
@@ -2279,7 +2293,7 @@
         <w:t xml:space="preserve">.</w:t>
       </w:r>
     </w:p>
-    <w:bookmarkStart w:id="25" w:name="results"/>
+    <w:bookmarkStart w:id="26" w:name="results"/>
     <w:p>
       <w:pPr>
         <w:pStyle w:val="Heading2"/>
@@ -3015,7 +3029,7 @@
       <w:tr>
         <w:tc>
           <w:tcPr/>
-          <w:bookmarkStart w:id="24" w:name="fig-study1"/>
+          <w:bookmarkStart w:id="25" w:name="fig-study1"/>
           <w:p>
             <w:pPr>
               <w:pStyle w:val="Compact"/>
@@ -3026,18 +3040,18 @@
                 <wp:inline>
                   <wp:extent cx="5334000" cy="3394363"/>
                   <wp:effectExtent b="0" l="0" r="0" t="0"/>
-                  <wp:docPr descr="" title="" id="22" name="Picture"/>
+                  <wp:docPr descr="" title="" id="23" name="Picture"/>
                   <a:graphic>
                     <a:graphicData uri="http://schemas.openxmlformats.org/drawingml/2006/picture">
                       <pic:pic>
                         <pic:nvPicPr>
-                          <pic:cNvPr descr="../5.%20Analysis/figures/combined_study1.png" id="23" name="Picture"/>
+                          <pic:cNvPr descr="../5.%20Analysis/figures/combined_study1.png" id="24" name="Picture"/>
                           <pic:cNvPicPr>
                             <a:picLocks noChangeArrowheads="1" noChangeAspect="1"/>
                           </pic:cNvPicPr>
                         </pic:nvPicPr>
                         <pic:blipFill>
-                          <a:blip r:embed="rId21"/>
+                          <a:blip r:embed="rId22"/>
                           <a:stretch>
                             <a:fillRect/>
                           </a:stretch>
@@ -3077,7 +3091,7 @@
               <w:t xml:space="preserve">Figure 2: Study 1. (A) Proportion of judgments choosing the classmate who was told the emotion (vs. the fact), by emotion condition and measure, for children and adults; dashed line = chance; * BF₁₀ ≥ 3, ** ≥ 10, *** ≥ 100. (B) Predicted probability of choosing the emotion for the better-friend judgment across age, by condition. (C) Predicted probability of choosing the emotion for food sharing across age, by condition and item. In (B) and (C), solid lines are model estimates for children and dashed lines are adult observed means.</w:t>
             </w:r>
           </w:p>
-          <w:bookmarkEnd w:id="24"/>
+          <w:bookmarkEnd w:id="25"/>
         </w:tc>
       </w:tr>
     </w:tbl>
@@ -3182,8 +3196,8 @@
         <w:t xml:space="preserve">we interpret the difference cautiously.</w:t>
       </w:r>
     </w:p>
-    <w:bookmarkEnd w:id="25"/>
-    <w:bookmarkStart w:id="26" w:name="discussion"/>
+    <w:bookmarkEnd w:id="26"/>
+    <w:bookmarkStart w:id="27" w:name="discussion"/>
     <w:p>
       <w:pPr>
         <w:pStyle w:val="Heading2"/>
@@ -3290,9 +3304,9 @@
         <w:t xml:space="preserve">is sad or happy.</w:t>
       </w:r>
     </w:p>
-    <w:bookmarkEnd w:id="26"/>
     <w:bookmarkEnd w:id="27"/>
-    <w:bookmarkStart w:id="34" w:name="X5cf640f6e4522935558f4111e42339336f0bdba"/>
+    <w:bookmarkEnd w:id="28"/>
+    <w:bookmarkStart w:id="35" w:name="X5cf640f6e4522935558f4111e42339336f0bdba"/>
     <w:p>
       <w:pPr>
         <w:pStyle w:val="Heading1"/>
@@ -3377,7 +3391,7 @@
         <w:t xml:space="preserve">explores a type of close relationship that does not include family ties.</w:t>
       </w:r>
     </w:p>
-    <w:bookmarkStart w:id="32" w:name="results-1"/>
+    <w:bookmarkStart w:id="33" w:name="results-1"/>
     <w:p>
       <w:pPr>
         <w:pStyle w:val="Heading2"/>
@@ -3766,7 +3780,7 @@
       <w:tr>
         <w:tc>
           <w:tcPr/>
-          <w:bookmarkStart w:id="31" w:name="fig-study2"/>
+          <w:bookmarkStart w:id="32" w:name="fig-study2"/>
           <w:p>
             <w:pPr>
               <w:pStyle w:val="Compact"/>
@@ -3777,18 +3791,18 @@
                 <wp:inline>
                   <wp:extent cx="5334000" cy="2521527"/>
                   <wp:effectExtent b="0" l="0" r="0" t="0"/>
-                  <wp:docPr descr="" title="" id="29" name="Picture"/>
+                  <wp:docPr descr="" title="" id="30" name="Picture"/>
                   <a:graphic>
                     <a:graphicData uri="http://schemas.openxmlformats.org/drawingml/2006/picture">
                       <pic:pic>
                         <pic:nvPicPr>
-                          <pic:cNvPr descr="../5.%20Analysis/figures/combined_study2.png" id="30" name="Picture"/>
+                          <pic:cNvPr descr="../5.%20Analysis/figures/combined_study2.png" id="31" name="Picture"/>
                           <pic:cNvPicPr>
                             <a:picLocks noChangeArrowheads="1" noChangeAspect="1"/>
                           </pic:cNvPicPr>
                         </pic:nvPicPr>
                         <pic:blipFill>
-                          <a:blip r:embed="rId28"/>
+                          <a:blip r:embed="rId29"/>
                           <a:stretch>
                             <a:fillRect/>
                           </a:stretch>
@@ -3828,7 +3842,7 @@
               <w:t xml:space="preserve">Figure 3: Study 2. (A) Proportion of judgments that the protagonist would disclose the emotion (vs. the fact) to a friend vs. a best friend, by emotion condition, for children and adults. (B) Predicted probability of choosing the emotion across age, by condition and relationship; solid lines are model estimates for children, dashed lines are adult observed means, and points are individual children.</w:t>
             </w:r>
           </w:p>
-          <w:bookmarkEnd w:id="31"/>
+          <w:bookmarkEnd w:id="32"/>
         </w:tc>
       </w:tr>
     </w:tbl>
@@ -3894,8 +3908,8 @@
         <w:t xml:space="preserve">showed little differentiation (see Supplement, Table S11).</w:t>
       </w:r>
     </w:p>
-    <w:bookmarkEnd w:id="32"/>
-    <w:bookmarkStart w:id="33" w:name="discussion-1"/>
+    <w:bookmarkEnd w:id="33"/>
+    <w:bookmarkStart w:id="34" w:name="discussion-1"/>
     <w:p>
       <w:pPr>
         <w:pStyle w:val="Heading2"/>
@@ -3993,9 +4007,9 @@
         <w:t xml:space="preserve">looking more adult-like with age.</w:t>
       </w:r>
     </w:p>
-    <w:bookmarkEnd w:id="33"/>
     <w:bookmarkEnd w:id="34"/>
-    <w:bookmarkStart w:id="45" w:name="X8baf3738b9021ab9ba60f22c31fba3c1e3fd991"/>
+    <w:bookmarkEnd w:id="35"/>
+    <w:bookmarkStart w:id="46" w:name="X8baf3738b9021ab9ba60f22c31fba3c1e3fd991"/>
     <w:p>
       <w:pPr>
         <w:pStyle w:val="Heading1"/>
@@ -4004,7 +4018,7 @@
         <w:t xml:space="preserve">Study 3: Using emotional disclosure to create and advance social closeness</w:t>
       </w:r>
     </w:p>
-    <w:bookmarkStart w:id="37" w:name="study-3.a"/>
+    <w:bookmarkStart w:id="38" w:name="study-3.a"/>
     <w:p>
       <w:pPr>
         <w:pStyle w:val="Heading2"/>
@@ -4063,7 +4077,7 @@
         <w:t xml:space="preserve">investigate this possibility.</w:t>
       </w:r>
     </w:p>
-    <w:bookmarkStart w:id="35" w:name="methods"/>
+    <w:bookmarkStart w:id="36" w:name="methods"/>
     <w:p>
       <w:pPr>
         <w:pStyle w:val="Heading3"/>
@@ -4098,8 +4112,8 @@
         <w:t xml:space="preserve">disclose the fact or their emotional state to achieve this goal.</w:t>
       </w:r>
     </w:p>
-    <w:bookmarkEnd w:id="35"/>
-    <w:bookmarkStart w:id="36" w:name="results-2"/>
+    <w:bookmarkEnd w:id="36"/>
+    <w:bookmarkStart w:id="37" w:name="results-2"/>
     <w:p>
       <w:pPr>
         <w:pStyle w:val="Heading3"/>
@@ -4318,9 +4332,9 @@
         <w:t xml:space="preserve">A).</w:t>
       </w:r>
     </w:p>
-    <w:bookmarkEnd w:id="36"/>
     <w:bookmarkEnd w:id="37"/>
-    <w:bookmarkStart w:id="43" w:name="study-3.b"/>
+    <w:bookmarkEnd w:id="38"/>
+    <w:bookmarkStart w:id="44" w:name="study-3.b"/>
     <w:p>
       <w:pPr>
         <w:pStyle w:val="Heading2"/>
@@ -4355,7 +4369,7 @@
         <w:t xml:space="preserve">fact or their emotion.</w:t>
       </w:r>
     </w:p>
-    <w:bookmarkStart w:id="42" w:name="results-3"/>
+    <w:bookmarkStart w:id="43" w:name="results-3"/>
     <w:p>
       <w:pPr>
         <w:pStyle w:val="Heading3"/>
@@ -4605,7 +4619,7 @@
       <w:tr>
         <w:tc>
           <w:tcPr/>
-          <w:bookmarkStart w:id="41" w:name="fig-study3-age"/>
+          <w:bookmarkStart w:id="42" w:name="fig-study3-age"/>
           <w:p>
             <w:pPr>
               <w:pStyle w:val="Compact"/>
@@ -4616,18 +4630,18 @@
                 <wp:inline>
                   <wp:extent cx="5334000" cy="2560319"/>
                   <wp:effectExtent b="0" l="0" r="0" t="0"/>
-                  <wp:docPr descr="" title="" id="39" name="Picture"/>
+                  <wp:docPr descr="" title="" id="40" name="Picture"/>
                   <a:graphic>
                     <a:graphicData uri="http://schemas.openxmlformats.org/drawingml/2006/picture">
                       <pic:pic>
                         <pic:nvPicPr>
-                          <pic:cNvPr descr="../5.%20Analysis/figures/combined_study3_age.png" id="40" name="Picture"/>
+                          <pic:cNvPr descr="../5.%20Analysis/figures/combined_study3_age.png" id="41" name="Picture"/>
                           <pic:cNvPicPr>
                             <a:picLocks noChangeArrowheads="1" noChangeAspect="1"/>
                           </pic:cNvPicPr>
                         </pic:nvPicPr>
                         <pic:blipFill>
-                          <a:blip r:embed="rId38"/>
+                          <a:blip r:embed="rId39"/>
                           <a:stretch>
                             <a:fillRect/>
                           </a:stretch>
@@ -4667,13 +4681,13 @@
               <w:t xml:space="preserve">Figure 4: Study 3 developmental change. Predicted probability of choosing the emotion (vs. the fact) across age, by condition, for (A) Study 3.A (creating a new relationship) and (B) Study 3.B (deepening an existing friendship). Solid lines are model estimates for children; dashed lines are adult observed means.</w:t>
             </w:r>
           </w:p>
-          <w:bookmarkEnd w:id="41"/>
+          <w:bookmarkEnd w:id="42"/>
         </w:tc>
       </w:tr>
     </w:tbl>
-    <w:bookmarkEnd w:id="42"/>
     <w:bookmarkEnd w:id="43"/>
-    <w:bookmarkStart w:id="44" w:name="discussion-2"/>
+    <w:bookmarkEnd w:id="44"/>
+    <w:bookmarkStart w:id="45" w:name="discussion-2"/>
     <w:p>
       <w:pPr>
         <w:pStyle w:val="Heading2"/>
@@ -4782,9 +4796,9 @@
         <w:t xml:space="preserve">(Thomas et al., 2025)</w:t>
       </w:r>
     </w:p>
-    <w:bookmarkEnd w:id="44"/>
     <w:bookmarkEnd w:id="45"/>
-    <w:bookmarkStart w:id="60" w:name="X56105b6af97e4cc360f4fc502cd682b132e85ec"/>
+    <w:bookmarkEnd w:id="46"/>
+    <w:bookmarkStart w:id="61" w:name="X56105b6af97e4cc360f4fc502cd682b132e85ec"/>
     <w:p>
       <w:pPr>
         <w:pStyle w:val="Heading1"/>
@@ -4945,7 +4959,7 @@
         <w:t xml:space="preserve">close.</w:t>
       </w:r>
     </w:p>
-    <w:bookmarkStart w:id="52" w:name="study-4.a"/>
+    <w:bookmarkStart w:id="53" w:name="study-4.a"/>
     <w:p>
       <w:pPr>
         <w:pStyle w:val="Heading2"/>
@@ -4954,7 +4968,7 @@
         <w:t xml:space="preserve">Study 4.A</w:t>
       </w:r>
     </w:p>
-    <w:bookmarkStart w:id="46" w:name="methods-1"/>
+    <w:bookmarkStart w:id="47" w:name="methods-1"/>
     <w:p>
       <w:pPr>
         <w:pStyle w:val="Heading3"/>
@@ -4989,8 +5003,8 @@
         <w:t xml:space="preserve">fact or their emotional state across the happy and sad conditions.</w:t>
       </w:r>
     </w:p>
-    <w:bookmarkEnd w:id="46"/>
-    <w:bookmarkStart w:id="51" w:name="results-4"/>
+    <w:bookmarkEnd w:id="47"/>
+    <w:bookmarkStart w:id="52" w:name="results-4"/>
     <w:p>
       <w:pPr>
         <w:pStyle w:val="Heading3"/>
@@ -5397,7 +5411,7 @@
       <w:tr>
         <w:tc>
           <w:tcPr/>
-          <w:bookmarkStart w:id="50" w:name="fig-study4a"/>
+          <w:bookmarkStart w:id="51" w:name="fig-study4a"/>
           <w:p>
             <w:pPr>
               <w:pStyle w:val="Compact"/>
@@ -5408,18 +5422,18 @@
                 <wp:inline>
                   <wp:extent cx="5334000" cy="2521527"/>
                   <wp:effectExtent b="0" l="0" r="0" t="0"/>
-                  <wp:docPr descr="" title="" id="48" name="Picture"/>
+                  <wp:docPr descr="" title="" id="49" name="Picture"/>
                   <a:graphic>
                     <a:graphicData uri="http://schemas.openxmlformats.org/drawingml/2006/picture">
                       <pic:pic>
                         <pic:nvPicPr>
-                          <pic:cNvPr descr="../5.%20Analysis/figures/combined_study4A.png" id="49" name="Picture"/>
+                          <pic:cNvPr descr="../5.%20Analysis/figures/combined_study4A.png" id="50" name="Picture"/>
                           <pic:cNvPicPr>
                             <a:picLocks noChangeArrowheads="1" noChangeAspect="1"/>
                           </pic:cNvPicPr>
                         </pic:nvPicPr>
                         <pic:blipFill>
-                          <a:blip r:embed="rId47"/>
+                          <a:blip r:embed="rId48"/>
                           <a:stretch>
                             <a:fillRect/>
                           </a:stretch>
@@ -5459,7 +5473,7 @@
               <w:t xml:space="preserve">Figure 5: Study 4.A. (A) Proportion of judgments that the protagonist would disclose the emotion (vs. the fact) to their mother vs. a friend’s mother, by emotion condition, for children and adults. (B) Predicted probability of choosing the emotion across age, by condition and relationship; solid lines are model estimates for children and dashed lines are adult observed means.</w:t>
             </w:r>
           </w:p>
-          <w:bookmarkEnd w:id="50"/>
+          <w:bookmarkEnd w:id="51"/>
         </w:tc>
       </w:tr>
     </w:tbl>
@@ -5507,9 +5521,9 @@
         <w:t xml:space="preserve">, panel B).</w:t>
       </w:r>
     </w:p>
-    <w:bookmarkEnd w:id="51"/>
     <w:bookmarkEnd w:id="52"/>
-    <w:bookmarkStart w:id="58" w:name="study-4.b"/>
+    <w:bookmarkEnd w:id="53"/>
+    <w:bookmarkStart w:id="59" w:name="study-4.b"/>
     <w:p>
       <w:pPr>
         <w:pStyle w:val="Heading2"/>
@@ -5556,7 +5570,7 @@
         <w:t xml:space="preserve">her emotional state.</w:t>
       </w:r>
     </w:p>
-    <w:bookmarkStart w:id="57" w:name="results-5"/>
+    <w:bookmarkStart w:id="58" w:name="results-5"/>
     <w:p>
       <w:pPr>
         <w:pStyle w:val="Heading3"/>
@@ -5957,7 +5971,7 @@
       <w:tr>
         <w:tc>
           <w:tcPr/>
-          <w:bookmarkStart w:id="56" w:name="fig-study4b"/>
+          <w:bookmarkStart w:id="57" w:name="fig-study4b"/>
           <w:p>
             <w:pPr>
               <w:pStyle w:val="Compact"/>
@@ -5968,18 +5982,18 @@
                 <wp:inline>
                   <wp:extent cx="5334000" cy="2521527"/>
                   <wp:effectExtent b="0" l="0" r="0" t="0"/>
-                  <wp:docPr descr="" title="" id="54" name="Picture"/>
+                  <wp:docPr descr="" title="" id="55" name="Picture"/>
                   <a:graphic>
                     <a:graphicData uri="http://schemas.openxmlformats.org/drawingml/2006/picture">
                       <pic:pic>
                         <pic:nvPicPr>
-                          <pic:cNvPr descr="../5.%20Analysis/figures/combined_study4B.png" id="55" name="Picture"/>
+                          <pic:cNvPr descr="../5.%20Analysis/figures/combined_study4B.png" id="56" name="Picture"/>
                           <pic:cNvPicPr>
                             <a:picLocks noChangeArrowheads="1" noChangeAspect="1"/>
                           </pic:cNvPicPr>
                         </pic:nvPicPr>
                         <pic:blipFill>
-                          <a:blip r:embed="rId53"/>
+                          <a:blip r:embed="rId54"/>
                           <a:stretch>
                             <a:fillRect/>
                           </a:stretch>
@@ -6019,7 +6033,7 @@
               <w:t xml:space="preserve">Figure 6: Study 4.B. (A) Proportion of judgments that the mother / friend’s mother would disclose the emotion (vs. the fact) to the protagonist, by emotion condition, for children and adults. (B) Predicted probability of choosing the emotion across age, by condition and relationship; solid lines are model estimates for children and dashed lines are adult observed means.</w:t>
             </w:r>
           </w:p>
-          <w:bookmarkEnd w:id="56"/>
+          <w:bookmarkEnd w:id="57"/>
         </w:tc>
       </w:tr>
     </w:tbl>
@@ -6067,9 +6081,9 @@
         <w:t xml:space="preserve">, panel B).</w:t>
       </w:r>
     </w:p>
-    <w:bookmarkEnd w:id="57"/>
     <w:bookmarkEnd w:id="58"/>
-    <w:bookmarkStart w:id="59" w:name="discussion-3"/>
+    <w:bookmarkEnd w:id="59"/>
+    <w:bookmarkStart w:id="60" w:name="discussion-3"/>
     <w:p>
       <w:pPr>
         <w:pStyle w:val="Heading2"/>
@@ -6208,9 +6222,9 @@
         <w:t xml:space="preserve">similar expectations when the roles are reversed.</w:t>
       </w:r>
     </w:p>
-    <w:bookmarkEnd w:id="59"/>
     <w:bookmarkEnd w:id="60"/>
-    <w:bookmarkStart w:id="62" w:name="general-discussion"/>
+    <w:bookmarkEnd w:id="61"/>
+    <w:bookmarkStart w:id="63" w:name="general-discussion"/>
     <w:p>
       <w:pPr>
         <w:pStyle w:val="Heading1"/>
@@ -7246,7 +7260,7 @@
         <w:t xml:space="preserve">of information disclosure.</w:t>
       </w:r>
     </w:p>
-    <w:bookmarkStart w:id="61" w:name="constraints-on-generality"/>
+    <w:bookmarkStart w:id="62" w:name="constraints-on-generality"/>
     <w:p>
       <w:pPr>
         <w:pStyle w:val="Heading2"/>
@@ -7386,9 +7400,9 @@
         <w:t xml:space="preserve">though this remains to be established.</w:t>
       </w:r>
     </w:p>
-    <w:bookmarkEnd w:id="61"/>
     <w:bookmarkEnd w:id="62"/>
-    <w:bookmarkStart w:id="63" w:name="author-note"/>
+    <w:bookmarkEnd w:id="63"/>
+    <w:bookmarkStart w:id="64" w:name="author-note"/>
     <w:p>
       <w:pPr>
         <w:pStyle w:val="Heading1"/>
@@ -7446,7 +7460,21 @@
         <w:t xml:space="preserve"> </w:t>
       </w:r>
       <w:r>
-        <w:t xml:space="preserve">are available at [anonymized repository link].</w:t>
+        <w:t xml:space="preserve">are available at</w:t>
+      </w:r>
+      <w:r>
+        <w:t xml:space="preserve"> </w:t>
+      </w:r>
+      <w:hyperlink r:id="rId19">
+        <w:r>
+          <w:rPr>
+            <w:rStyle w:val="Hyperlink"/>
+          </w:rPr>
+          <w:t xml:space="preserve">https://anonymous.4open.science/r/OMIT-74BB/</w:t>
+        </w:r>
+      </w:hyperlink>
+      <w:r>
+        <w:t xml:space="preserve">.</w:t>
       </w:r>
     </w:p>
     <w:p>
@@ -7465,8 +7493,8 @@
         <w:t xml:space="preserve">[Correspondence information removed for anonymous review.]</w:t>
       </w:r>
     </w:p>
-    <w:bookmarkEnd w:id="63"/>
-    <w:bookmarkStart w:id="115" w:name="references"/>
+    <w:bookmarkEnd w:id="64"/>
+    <w:bookmarkStart w:id="116" w:name="references"/>
     <w:p>
       <w:pPr>
         <w:pStyle w:val="Heading1"/>
@@ -7475,8 +7503,8 @@
         <w:t xml:space="preserve">References</w:t>
       </w:r>
     </w:p>
-    <w:bookmarkStart w:id="114" w:name="refs"/>
-    <w:bookmarkStart w:id="65" w:name="ref-afshordi2021"/>
+    <w:bookmarkStart w:id="115" w:name="refs"/>
+    <w:bookmarkStart w:id="66" w:name="ref-afshordi2021"/>
     <w:p>
       <w:pPr>
         <w:pStyle w:val="Bibliography"/>
@@ -7513,7 +7541,7 @@
       <w:r>
         <w:t xml:space="preserve"> </w:t>
       </w:r>
-      <w:hyperlink r:id="rId64">
+      <w:hyperlink r:id="rId65">
         <w:r>
           <w:rPr>
             <w:rStyle w:val="Hyperlink"/>
@@ -7522,8 +7550,8 @@
         </w:r>
       </w:hyperlink>
     </w:p>
-    <w:bookmarkEnd w:id="65"/>
-    <w:bookmarkStart w:id="67" w:name="ref-anagnostaki2013"/>
+    <w:bookmarkEnd w:id="66"/>
+    <w:bookmarkStart w:id="68" w:name="ref-anagnostaki2013"/>
     <w:p>
       <w:pPr>
         <w:pStyle w:val="Bibliography"/>
@@ -7560,7 +7588,7 @@
       <w:r>
         <w:t xml:space="preserve"> </w:t>
       </w:r>
-      <w:hyperlink r:id="rId66">
+      <w:hyperlink r:id="rId67">
         <w:r>
           <w:rPr>
             <w:rStyle w:val="Hyperlink"/>
@@ -7569,8 +7597,8 @@
         </w:r>
       </w:hyperlink>
     </w:p>
-    <w:bookmarkEnd w:id="67"/>
-    <w:bookmarkStart w:id="69" w:name="ref-appelbaum2018jars"/>
+    <w:bookmarkEnd w:id="68"/>
+    <w:bookmarkStart w:id="70" w:name="ref-appelbaum2018jars"/>
     <w:p>
       <w:pPr>
         <w:pStyle w:val="Bibliography"/>
@@ -7619,7 +7647,7 @@
       <w:r>
         <w:t xml:space="preserve"> </w:t>
       </w:r>
-      <w:hyperlink r:id="rId68">
+      <w:hyperlink r:id="rId69">
         <w:r>
           <w:rPr>
             <w:rStyle w:val="Hyperlink"/>
@@ -7628,8 +7656,8 @@
         </w:r>
       </w:hyperlink>
     </w:p>
-    <w:bookmarkEnd w:id="69"/>
-    <w:bookmarkStart w:id="71" w:name="ref-burke2022"/>
+    <w:bookmarkEnd w:id="70"/>
+    <w:bookmarkStart w:id="72" w:name="ref-burke2022"/>
     <w:p>
       <w:pPr>
         <w:pStyle w:val="Bibliography"/>
@@ -7666,7 +7694,7 @@
       <w:r>
         <w:t xml:space="preserve"> </w:t>
       </w:r>
-      <w:hyperlink r:id="rId70">
+      <w:hyperlink r:id="rId71">
         <w:r>
           <w:rPr>
             <w:rStyle w:val="Hyperlink"/>
@@ -7675,8 +7703,8 @@
         </w:r>
       </w:hyperlink>
     </w:p>
-    <w:bookmarkEnd w:id="71"/>
-    <w:bookmarkStart w:id="73" w:name="ref-burkner2018brms"/>
+    <w:bookmarkEnd w:id="72"/>
+    <w:bookmarkStart w:id="74" w:name="ref-burkner2018brms"/>
     <w:p>
       <w:pPr>
         <w:pStyle w:val="Bibliography"/>
@@ -7713,7 +7741,7 @@
       <w:r>
         <w:t xml:space="preserve"> </w:t>
       </w:r>
-      <w:hyperlink r:id="rId72">
+      <w:hyperlink r:id="rId73">
         <w:r>
           <w:rPr>
             <w:rStyle w:val="Hyperlink"/>
@@ -7722,8 +7750,8 @@
         </w:r>
       </w:hyperlink>
     </w:p>
-    <w:bookmarkEnd w:id="73"/>
-    <w:bookmarkStart w:id="74" w:name="ref-chelune1984"/>
+    <w:bookmarkEnd w:id="74"/>
+    <w:bookmarkStart w:id="75" w:name="ref-chelune1984"/>
     <w:p>
       <w:pPr>
         <w:pStyle w:val="Bibliography"/>
@@ -7758,8 +7786,8 @@
         <w:t xml:space="preserve">(1), 213.</w:t>
       </w:r>
     </w:p>
-    <w:bookmarkEnd w:id="74"/>
-    <w:bookmarkStart w:id="76" w:name="ref-clark1979"/>
+    <w:bookmarkEnd w:id="75"/>
+    <w:bookmarkStart w:id="77" w:name="ref-clark1979"/>
     <w:p>
       <w:pPr>
         <w:pStyle w:val="Bibliography"/>
@@ -7796,7 +7824,7 @@
       <w:r>
         <w:t xml:space="preserve"> </w:t>
       </w:r>
-      <w:hyperlink r:id="rId75">
+      <w:hyperlink r:id="rId76">
         <w:r>
           <w:rPr>
             <w:rStyle w:val="Hyperlink"/>
@@ -7805,8 +7833,8 @@
         </w:r>
       </w:hyperlink>
     </w:p>
-    <w:bookmarkEnd w:id="76"/>
-    <w:bookmarkStart w:id="77" w:name="ref-crockett2025empathy"/>
+    <w:bookmarkEnd w:id="77"/>
+    <w:bookmarkStart w:id="78" w:name="ref-crockett2025empathy"/>
     <w:p>
       <w:pPr>
         <w:pStyle w:val="Bibliography"/>
@@ -7828,8 +7856,8 @@
         <w:t xml:space="preserve">.</w:t>
       </w:r>
     </w:p>
-    <w:bookmarkEnd w:id="77"/>
-    <w:bookmarkStart w:id="79" w:name="ref-derlega2008"/>
+    <w:bookmarkEnd w:id="78"/>
+    <w:bookmarkStart w:id="80" w:name="ref-derlega2008"/>
     <w:p>
       <w:pPr>
         <w:pStyle w:val="Bibliography"/>
@@ -7866,7 +7894,7 @@
       <w:r>
         <w:t xml:space="preserve"> </w:t>
       </w:r>
-      <w:hyperlink r:id="rId78">
+      <w:hyperlink r:id="rId79">
         <w:r>
           <w:rPr>
             <w:rStyle w:val="Hyperlink"/>
@@ -7875,8 +7903,8 @@
         </w:r>
       </w:hyperlink>
     </w:p>
-    <w:bookmarkEnd w:id="79"/>
-    <w:bookmarkStart w:id="80" w:name="ref-finkenauer2015know"/>
+    <w:bookmarkEnd w:id="80"/>
+    <w:bookmarkStart w:id="81" w:name="ref-finkenauer2015know"/>
     <w:p>
       <w:pPr>
         <w:pStyle w:val="Bibliography"/>
@@ -7911,8 +7939,8 @@
         <w:t xml:space="preserve">(1), 109–118.</w:t>
       </w:r>
     </w:p>
-    <w:bookmarkEnd w:id="80"/>
-    <w:bookmarkStart w:id="82" w:name="ref-fiske1992"/>
+    <w:bookmarkEnd w:id="81"/>
+    <w:bookmarkStart w:id="83" w:name="ref-fiske1992"/>
     <w:p>
       <w:pPr>
         <w:pStyle w:val="Bibliography"/>
@@ -7949,7 +7977,7 @@
       <w:r>
         <w:t xml:space="preserve"> </w:t>
       </w:r>
-      <w:hyperlink r:id="rId81">
+      <w:hyperlink r:id="rId82">
         <w:r>
           <w:rPr>
             <w:rStyle w:val="Hyperlink"/>
@@ -7958,8 +7986,8 @@
         </w:r>
       </w:hyperlink>
     </w:p>
-    <w:bookmarkEnd w:id="82"/>
-    <w:bookmarkStart w:id="84" w:name="ref-liberman2018"/>
+    <w:bookmarkEnd w:id="83"/>
+    <w:bookmarkStart w:id="85" w:name="ref-liberman2018"/>
     <w:p>
       <w:pPr>
         <w:pStyle w:val="Bibliography"/>
@@ -7996,7 +8024,7 @@
       <w:r>
         <w:t xml:space="preserve"> </w:t>
       </w:r>
-      <w:hyperlink r:id="rId83">
+      <w:hyperlink r:id="rId84">
         <w:r>
           <w:rPr>
             <w:rStyle w:val="Hyperlink"/>
@@ -8005,8 +8033,8 @@
         </w:r>
       </w:hyperlink>
     </w:p>
-    <w:bookmarkEnd w:id="84"/>
-    <w:bookmarkStart w:id="85" w:name="ref-powell2022adopted"/>
+    <w:bookmarkEnd w:id="85"/>
+    <w:bookmarkStart w:id="86" w:name="ref-powell2022adopted"/>
     <w:p>
       <w:pPr>
         <w:pStyle w:val="Bibliography"/>
@@ -8041,8 +8069,8 @@
         <w:t xml:space="preserve">(5), 1215–1233.</w:t>
       </w:r>
     </w:p>
-    <w:bookmarkEnd w:id="85"/>
-    <w:bookmarkStart w:id="87" w:name="ref-rcoreteam2025"/>
+    <w:bookmarkEnd w:id="86"/>
+    <w:bookmarkStart w:id="88" w:name="ref-rcoreteam2025"/>
     <w:p>
       <w:pPr>
         <w:pStyle w:val="Bibliography"/>
@@ -8066,7 +8094,7 @@
       <w:r>
         <w:t xml:space="preserve"> </w:t>
       </w:r>
-      <w:hyperlink r:id="rId86">
+      <w:hyperlink r:id="rId87">
         <w:r>
           <w:rPr>
             <w:rStyle w:val="Hyperlink"/>
@@ -8075,8 +8103,8 @@
         </w:r>
       </w:hyperlink>
     </w:p>
-    <w:bookmarkEnd w:id="87"/>
-    <w:bookmarkStart w:id="89" w:name="ref-rumsey2013opacity"/>
+    <w:bookmarkEnd w:id="88"/>
+    <w:bookmarkStart w:id="90" w:name="ref-rumsey2013opacity"/>
     <w:p>
       <w:pPr>
         <w:pStyle w:val="Bibliography"/>
@@ -8113,7 +8141,7 @@
       <w:r>
         <w:t xml:space="preserve"> </w:t>
       </w:r>
-      <w:hyperlink r:id="rId88">
+      <w:hyperlink r:id="rId89">
         <w:r>
           <w:rPr>
             <w:rStyle w:val="Hyperlink"/>
@@ -8122,8 +8150,8 @@
         </w:r>
       </w:hyperlink>
     </w:p>
-    <w:bookmarkEnd w:id="89"/>
-    <w:bookmarkStart w:id="91" w:name="ref-scott2017lookit"/>
+    <w:bookmarkEnd w:id="90"/>
+    <w:bookmarkStart w:id="92" w:name="ref-scott2017lookit"/>
     <w:p>
       <w:pPr>
         <w:pStyle w:val="Bibliography"/>
@@ -8160,7 +8188,7 @@
       <w:r>
         <w:t xml:space="preserve"> </w:t>
       </w:r>
-      <w:hyperlink r:id="rId90">
+      <w:hyperlink r:id="rId91">
         <w:r>
           <w:rPr>
             <w:rStyle w:val="Hyperlink"/>
@@ -8169,8 +8197,8 @@
         </w:r>
       </w:hyperlink>
     </w:p>
-    <w:bookmarkEnd w:id="91"/>
-    <w:bookmarkStart w:id="93" w:name="ref-shields2024"/>
+    <w:bookmarkEnd w:id="92"/>
+    <w:bookmarkStart w:id="94" w:name="ref-shields2024"/>
     <w:p>
       <w:pPr>
         <w:pStyle w:val="Bibliography"/>
@@ -8207,7 +8235,7 @@
       <w:r>
         <w:t xml:space="preserve"> </w:t>
       </w:r>
-      <w:hyperlink r:id="rId92">
+      <w:hyperlink r:id="rId93">
         <w:r>
           <w:rPr>
             <w:rStyle w:val="Hyperlink"/>
@@ -8216,8 +8244,8 @@
         </w:r>
       </w:hyperlink>
     </w:p>
-    <w:bookmarkEnd w:id="93"/>
-    <w:bookmarkStart w:id="95" w:name="ref-shutts2021"/>
+    <w:bookmarkEnd w:id="94"/>
+    <w:bookmarkStart w:id="96" w:name="ref-shutts2021"/>
     <w:p>
       <w:pPr>
         <w:pStyle w:val="Bibliography"/>
@@ -8244,7 +8272,7 @@
       <w:r>
         <w:t xml:space="preserve"> </w:t>
       </w:r>
-      <w:hyperlink r:id="rId94">
+      <w:hyperlink r:id="rId95">
         <w:r>
           <w:rPr>
             <w:rStyle w:val="Hyperlink"/>
@@ -8253,8 +8281,8 @@
         </w:r>
       </w:hyperlink>
     </w:p>
-    <w:bookmarkEnd w:id="95"/>
-    <w:bookmarkStart w:id="96" w:name="ref-simmel1906sociology"/>
+    <w:bookmarkEnd w:id="96"/>
+    <w:bookmarkStart w:id="97" w:name="ref-simmel1906sociology"/>
     <w:p>
       <w:pPr>
         <w:pStyle w:val="Bibliography"/>
@@ -8289,8 +8317,8 @@
         <w:t xml:space="preserve">(4), 441–498.</w:t>
       </w:r>
     </w:p>
-    <w:bookmarkEnd w:id="96"/>
-    <w:bookmarkStart w:id="98" w:name="ref-small2017"/>
+    <w:bookmarkEnd w:id="97"/>
+    <w:bookmarkStart w:id="99" w:name="ref-small2017"/>
     <w:p>
       <w:pPr>
         <w:pStyle w:val="Bibliography"/>
@@ -8317,7 +8345,7 @@
       <w:r>
         <w:t xml:space="preserve"> </w:t>
       </w:r>
-      <w:hyperlink r:id="rId97">
+      <w:hyperlink r:id="rId98">
         <w:r>
           <w:rPr>
             <w:rStyle w:val="Hyperlink"/>
@@ -8326,8 +8354,8 @@
         </w:r>
       </w:hyperlink>
     </w:p>
-    <w:bookmarkEnd w:id="98"/>
-    <w:bookmarkStart w:id="100" w:name="ref-spokes2016"/>
+    <w:bookmarkEnd w:id="99"/>
+    <w:bookmarkStart w:id="101" w:name="ref-spokes2016"/>
     <w:p>
       <w:pPr>
         <w:pStyle w:val="Bibliography"/>
@@ -8364,7 +8392,7 @@
       <w:r>
         <w:t xml:space="preserve"> </w:t>
       </w:r>
-      <w:hyperlink r:id="rId99">
+      <w:hyperlink r:id="rId100">
         <w:r>
           <w:rPr>
             <w:rStyle w:val="Hyperlink"/>
@@ -8373,8 +8401,8 @@
         </w:r>
       </w:hyperlink>
     </w:p>
-    <w:bookmarkEnd w:id="100"/>
-    <w:bookmarkStart w:id="102" w:name="ref-thomas2024"/>
+    <w:bookmarkEnd w:id="101"/>
+    <w:bookmarkStart w:id="103" w:name="ref-thomas2024"/>
     <w:p>
       <w:pPr>
         <w:pStyle w:val="Bibliography"/>
@@ -8398,7 +8426,7 @@
       <w:r>
         <w:t xml:space="preserve"> </w:t>
       </w:r>
-      <w:hyperlink r:id="rId101">
+      <w:hyperlink r:id="rId102">
         <w:r>
           <w:rPr>
             <w:rStyle w:val="Hyperlink"/>
@@ -8407,8 +8435,8 @@
         </w:r>
       </w:hyperlink>
     </w:p>
-    <w:bookmarkEnd w:id="102"/>
-    <w:bookmarkStart w:id="103" w:name="ref-thomas2025caregiving"/>
+    <w:bookmarkEnd w:id="103"/>
+    <w:bookmarkStart w:id="104" w:name="ref-thomas2025caregiving"/>
     <w:p>
       <w:pPr>
         <w:pStyle w:val="Bibliography"/>
@@ -8443,8 +8471,8 @@
         <w:t xml:space="preserve">(1), 14–35.</w:t>
       </w:r>
     </w:p>
-    <w:bookmarkEnd w:id="103"/>
-    <w:bookmarkStart w:id="105" w:name="ref-thomasSaliva2022"/>
+    <w:bookmarkEnd w:id="104"/>
+    <w:bookmarkStart w:id="106" w:name="ref-thomasSaliva2022"/>
     <w:p>
       <w:pPr>
         <w:pStyle w:val="Bibliography"/>
@@ -8481,7 +8509,7 @@
       <w:r>
         <w:t xml:space="preserve"> </w:t>
       </w:r>
-      <w:hyperlink r:id="rId104">
+      <w:hyperlink r:id="rId105">
         <w:r>
           <w:rPr>
             <w:rStyle w:val="Hyperlink"/>
@@ -8490,8 +8518,8 @@
         </w:r>
       </w:hyperlink>
     </w:p>
-    <w:bookmarkEnd w:id="105"/>
-    <w:bookmarkStart w:id="107" w:name="ref-thomsen2020"/>
+    <w:bookmarkEnd w:id="106"/>
+    <w:bookmarkStart w:id="108" w:name="ref-thomsen2020"/>
     <w:p>
       <w:pPr>
         <w:pStyle w:val="Bibliography"/>
@@ -8528,7 +8556,7 @@
       <w:r>
         <w:t xml:space="preserve"> </w:t>
       </w:r>
-      <w:hyperlink r:id="rId106">
+      <w:hyperlink r:id="rId107">
         <w:r>
           <w:rPr>
             <w:rStyle w:val="Hyperlink"/>
@@ -8537,8 +8565,8 @@
         </w:r>
       </w:hyperlink>
     </w:p>
-    <w:bookmarkEnd w:id="107"/>
-    <w:bookmarkStart w:id="109" w:name="ref-vijayakumar2020"/>
+    <w:bookmarkEnd w:id="108"/>
+    <w:bookmarkStart w:id="110" w:name="ref-vijayakumar2020"/>
     <w:p>
       <w:pPr>
         <w:pStyle w:val="Bibliography"/>
@@ -8575,7 +8603,7 @@
       <w:r>
         <w:t xml:space="preserve"> </w:t>
       </w:r>
-      <w:hyperlink r:id="rId108">
+      <w:hyperlink r:id="rId109">
         <w:r>
           <w:rPr>
             <w:rStyle w:val="Hyperlink"/>
@@ -8584,8 +8612,8 @@
         </w:r>
       </w:hyperlink>
     </w:p>
-    <w:bookmarkEnd w:id="109"/>
-    <w:bookmarkStart w:id="110" w:name="ref-wellman2015"/>
+    <w:bookmarkEnd w:id="110"/>
+    <w:bookmarkStart w:id="111" w:name="ref-wellman2015"/>
     <w:p>
       <w:pPr>
         <w:pStyle w:val="Bibliography"/>
@@ -8607,8 +8635,8 @@
         <w:t xml:space="preserve">. Oxford University Press.</w:t>
       </w:r>
     </w:p>
-    <w:bookmarkEnd w:id="110"/>
-    <w:bookmarkStart w:id="111" w:name="ref-willems2020role"/>
+    <w:bookmarkEnd w:id="111"/>
+    <w:bookmarkStart w:id="112" w:name="ref-willems2020role"/>
     <w:p>
       <w:pPr>
         <w:pStyle w:val="Bibliography"/>
@@ -8643,8 +8671,8 @@
         <w:t xml:space="preserve">, 33–37.</w:t>
       </w:r>
     </w:p>
-    <w:bookmarkEnd w:id="111"/>
-    <w:bookmarkStart w:id="113" w:name="ref-woo2024"/>
+    <w:bookmarkEnd w:id="112"/>
+    <w:bookmarkStart w:id="114" w:name="ref-woo2024"/>
     <w:p>
       <w:pPr>
         <w:pStyle w:val="Bibliography"/>
@@ -8681,7 +8709,7 @@
       <w:r>
         <w:t xml:space="preserve"> </w:t>
       </w:r>
-      <w:hyperlink r:id="rId112">
+      <w:hyperlink r:id="rId113">
         <w:r>
           <w:rPr>
             <w:rStyle w:val="Hyperlink"/>
@@ -8690,9 +8718,9 @@
         </w:r>
       </w:hyperlink>
     </w:p>
-    <w:bookmarkEnd w:id="113"/>
     <w:bookmarkEnd w:id="114"/>
     <w:bookmarkEnd w:id="115"/>
+    <w:bookmarkEnd w:id="116"/>
     <w:sectPr>
       <w:footnotePr>
         <w:numRestart w:val="eachSect"/>

</xml_diff>

<commit_message>
Reference in-repo pre-registrations (with link) in manuscript
Co-Authored-By: Claude Opus 4.8 <noreply@anthropic.com>
</commit_message>
<xml_diff>
--- a/6. Writing & Presentations/OMIT_manuscript_rendered.docx
+++ b/6. Writing & Presentations/OMIT_manuscript_rendered.docx
@@ -2036,13 +2036,25 @@
         <w:t xml:space="preserve"> </w:t>
       </w:r>
       <w:r>
-        <w:t xml:space="preserve">primary analyses were pre-registered (pre-registration links removed for</w:t>
-      </w:r>
-      <w:r>
-        <w:t xml:space="preserve"> </w:t>
-      </w:r>
-      <w:r>
-        <w:t xml:space="preserve">anonymous review).</w:t>
+        <w:t xml:space="preserve">primary analyses were pre-registered; the pre-registration documents are</w:t>
+      </w:r>
+      <w:r>
+        <w:t xml:space="preserve"> </w:t>
+      </w:r>
+      <w:r>
+        <w:t xml:space="preserve">included in that repository (in the</w:t>
+      </w:r>
+      <w:r>
+        <w:t xml:space="preserve"> </w:t>
+      </w:r>
+      <w:r>
+        <w:t xml:space="preserve">“Preregistration &amp; Ethics”</w:t>
+      </w:r>
+      <w:r>
+        <w:t xml:space="preserve"> </w:t>
+      </w:r>
+      <w:r>
+        <w:t xml:space="preserve">folder).</w:t>
       </w:r>
     </w:p>
     <w:bookmarkEnd w:id="20"/>
@@ -7442,25 +7454,19 @@
         <w:t xml:space="preserve"> </w:t>
       </w:r>
       <w:r>
-        <w:t xml:space="preserve">(Studies 1, 3.A, and 4.A: [pre-registration link removed for anonymous</w:t>
-      </w:r>
-      <w:r>
-        <w:t xml:space="preserve"> </w:t>
-      </w:r>
-      <w:r>
-        <w:t xml:space="preserve">review]; Studies 2, 3.B, and 4.B: [pre-registration link removed for</w:t>
-      </w:r>
-      <w:r>
-        <w:t xml:space="preserve"> </w:t>
-      </w:r>
-      <w:r>
-        <w:t xml:space="preserve">anonymous review]), and all data, analysis code, and study materials</w:t>
-      </w:r>
-      <w:r>
-        <w:t xml:space="preserve"> </w:t>
-      </w:r>
-      <w:r>
-        <w:t xml:space="preserve">are available at</w:t>
+        <w:t xml:space="preserve">(Studies 1, 3.A, and 4.A; and Studies 2, 3.B, and 4.B); the</w:t>
+      </w:r>
+      <w:r>
+        <w:t xml:space="preserve"> </w:t>
+      </w:r>
+      <w:r>
+        <w:t xml:space="preserve">pre-registration documents are included, together with all data,</w:t>
+      </w:r>
+      <w:r>
+        <w:t xml:space="preserve"> </w:t>
+      </w:r>
+      <w:r>
+        <w:t xml:space="preserve">analysis code, and study materials, at</w:t>
       </w:r>
       <w:r>
         <w:t xml:space="preserve"> </w:t>
@@ -7474,7 +7480,28 @@
         </w:r>
       </w:hyperlink>
       <w:r>
-        <w:t xml:space="preserve">.</w:t>
+        <w:t xml:space="preserve"> </w:t>
+      </w:r>
+      <w:r>
+        <w:t xml:space="preserve">(in the</w:t>
+      </w:r>
+      <w:r>
+        <w:t xml:space="preserve"> </w:t>
+      </w:r>
+      <w:r>
+        <w:t xml:space="preserve">“Preregistration</w:t>
+      </w:r>
+      <w:r>
+        <w:t xml:space="preserve"> </w:t>
+      </w:r>
+      <w:r>
+        <w:t xml:space="preserve">&amp; Ethics”</w:t>
+      </w:r>
+      <w:r>
+        <w:t xml:space="preserve"> </w:t>
+      </w:r>
+      <w:r>
+        <w:t xml:space="preserve">folder).</w:t>
       </w:r>
     </w:p>
     <w:p>

</xml_diff>

<commit_message>
Finalize manuscript: add PDF output (APA-styled, line-numbered); refresh docx/pdf
Co-Authored-By: Claude Opus 4.8 <noreply@anthropic.com>
</commit_message>
<xml_diff>
--- a/6. Writing & Presentations/OMIT_manuscript_rendered.docx
+++ b/6. Writing & Presentations/OMIT_manuscript_rendered.docx
@@ -194,73 +194,61 @@
         <w:t xml:space="preserve"> </w:t>
       </w:r>
       <w:r>
-        <w:t xml:space="preserve">something adults take for granted—that confiding sadness, rather than</w:t>
-      </w:r>
-      <w:r>
-        <w:t xml:space="preserve"> </w:t>
-      </w:r>
-      <w:r>
-        <w:t xml:space="preserve">sharing neutral facts or good news, is a mark of a close relationship.</w:t>
-      </w:r>
-      <w:r>
-        <w:t xml:space="preserve"> </w:t>
-      </w:r>
-      <w:r>
-        <w:t xml:space="preserve">Across four studies, six- to nine-year-olds expected people to reveal</w:t>
-      </w:r>
-      <w:r>
-        <w:t xml:space="preserve"> </w:t>
-      </w:r>
-      <w:r>
-        <w:t xml:space="preserve">their sad feelings to best friends and to their own mothers, but not to</w:t>
-      </w:r>
-      <w:r>
-        <w:t xml:space="preserve"> </w:t>
-      </w:r>
-      <w:r>
-        <w:t xml:space="preserve">friends or a friend’s parent, and they treated a child confiding in a</w:t>
-      </w:r>
-      <w:r>
-        <w:t xml:space="preserve"> </w:t>
-      </w:r>
-      <w:r>
-        <w:t xml:space="preserve">parent as different from a parent confiding in a child. Yet neither</w:t>
-      </w:r>
-      <w:r>
-        <w:t xml:space="preserve"> </w:t>
-      </w:r>
-      <w:r>
-        <w:t xml:space="preserve">children nor adults viewed opening up emotionally as a way to build a</w:t>
-      </w:r>
-      <w:r>
-        <w:t xml:space="preserve"> </w:t>
-      </w:r>
-      <w:r>
-        <w:t xml:space="preserve">new friendship, suggesting that people intuitively treat emotional</w:t>
-      </w:r>
-      <w:r>
-        <w:t xml:space="preserve"> </w:t>
-      </w:r>
-      <w:r>
-        <w:t xml:space="preserve">intimacy as belonging to relationships that are already close rather</w:t>
-      </w:r>
-      <w:r>
-        <w:t xml:space="preserve"> </w:t>
-      </w:r>
-      <w:r>
-        <w:t xml:space="preserve">than as a tool for creating closeness. These insights may help explain</w:t>
-      </w:r>
-      <w:r>
-        <w:t xml:space="preserve"> </w:t>
-      </w:r>
-      <w:r>
-        <w:t xml:space="preserve">why some children find it difficult to judge what to share, and with</w:t>
-      </w:r>
-      <w:r>
-        <w:t xml:space="preserve"> </w:t>
-      </w:r>
-      <w:r>
-        <w:t xml:space="preserve">whom.</w:t>
+        <w:t xml:space="preserve">something adults may take for granted—that confiding sadness, rather</w:t>
+      </w:r>
+      <w:r>
+        <w:t xml:space="preserve"> </w:t>
+      </w:r>
+      <w:r>
+        <w:t xml:space="preserve">than sharing neutral facts or good news, is a mark of a close</w:t>
+      </w:r>
+      <w:r>
+        <w:t xml:space="preserve"> </w:t>
+      </w:r>
+      <w:r>
+        <w:t xml:space="preserve">relationship. Across four studies, six- to nine-year-olds expected</w:t>
+      </w:r>
+      <w:r>
+        <w:t xml:space="preserve"> </w:t>
+      </w:r>
+      <w:r>
+        <w:t xml:space="preserve">people to reveal their sad feelings to best friends and to their own</w:t>
+      </w:r>
+      <w:r>
+        <w:t xml:space="preserve"> </w:t>
+      </w:r>
+      <w:r>
+        <w:t xml:space="preserve">mothers, but not to friends or a friend’s mother, and they treated a</w:t>
+      </w:r>
+      <w:r>
+        <w:t xml:space="preserve"> </w:t>
+      </w:r>
+      <w:r>
+        <w:t xml:space="preserve">child confiding in a mother as different from a mother confiding in a</w:t>
+      </w:r>
+      <w:r>
+        <w:t xml:space="preserve"> </w:t>
+      </w:r>
+      <w:r>
+        <w:t xml:space="preserve">child. Yet neither children nor adults viewed opening up emotionally as</w:t>
+      </w:r>
+      <w:r>
+        <w:t xml:space="preserve"> </w:t>
+      </w:r>
+      <w:r>
+        <w:t xml:space="preserve">a way to build a new friendship, suggesting that people intuitively</w:t>
+      </w:r>
+      <w:r>
+        <w:t xml:space="preserve"> </w:t>
+      </w:r>
+      <w:r>
+        <w:t xml:space="preserve">treat emotional intimacy as belonging to relationships that are already</w:t>
+      </w:r>
+      <w:r>
+        <w:t xml:space="preserve"> </w:t>
+      </w:r>
+      <w:r>
+        <w:t xml:space="preserve">close rather than as a tool for creating closeness.</w:t>
       </w:r>
     </w:p>
     <w:bookmarkEnd w:id="9"/>
@@ -6686,13 +6674,31 @@
         <w:t xml:space="preserve"> </w:t>
       </w:r>
       <w:r>
-        <w:t xml:space="preserve">come to have this knowledge. Children may have learned it through more</w:t>
-      </w:r>
-      <w:r>
-        <w:t xml:space="preserve"> </w:t>
-      </w:r>
-      <w:r>
-        <w:t xml:space="preserve">subtle cues (for example, social awkwardness can arise when someone</w:t>
+        <w:t xml:space="preserve">come to have this knowledge. Children may intuit a process whereby they</w:t>
+      </w:r>
+      <w:r>
+        <w:t xml:space="preserve"> </w:t>
+      </w:r>
+      <w:r>
+        <w:t xml:space="preserve">understand that disclosing negative emotions can make the discloser seem</w:t>
+      </w:r>
+      <w:r>
+        <w:t xml:space="preserve"> </w:t>
+      </w:r>
+      <w:r>
+        <w:t xml:space="preserve">less desirable as a social partner or imply that the target of</w:t>
+      </w:r>
+      <w:r>
+        <w:t xml:space="preserve"> </w:t>
+      </w:r>
+      <w:r>
+        <w:t xml:space="preserve">disclosure should help. Children may have learned it through more subtle</w:t>
+      </w:r>
+      <w:r>
+        <w:t xml:space="preserve"> </w:t>
+      </w:r>
+      <w:r>
+        <w:t xml:space="preserve">cues (for example, social awkwardness can arise when someone</w:t>
       </w:r>
       <w:r>
         <w:t xml:space="preserve"> </w:t>
@@ -6713,34 +6719,82 @@
         <w:t xml:space="preserve"> </w:t>
       </w:r>
       <w:r>
-        <w:t xml:space="preserve">provided empathy in a way that others cannot (refer to</w:t>
-      </w:r>
-      <w:r>
-        <w:t xml:space="preserve"> </w:t>
-      </w:r>
-      <w:r>
-        <w:t xml:space="preserve">Crockett (2025)</w:t>
-      </w:r>
-      <w:r>
-        <w:t xml:space="preserve">). Children may intuit a process whereby they</w:t>
-      </w:r>
-      <w:r>
-        <w:t xml:space="preserve"> </w:t>
-      </w:r>
-      <w:r>
-        <w:t xml:space="preserve">understand that disclosing negative emotions can make the discloser seem</w:t>
-      </w:r>
-      <w:r>
-        <w:t xml:space="preserve"> </w:t>
-      </w:r>
-      <w:r>
-        <w:t xml:space="preserve">less desirable as a social partner or imply that the target of</w:t>
-      </w:r>
-      <w:r>
-        <w:t xml:space="preserve"> </w:t>
-      </w:r>
-      <w:r>
-        <w:t xml:space="preserve">disclosure should help.</w:t>
+        <w:t xml:space="preserve">provided empathy in a way that others cannot. This last point resonates</w:t>
+      </w:r>
+      <w:r>
+        <w:t xml:space="preserve"> </w:t>
+      </w:r>
+      <w:r>
+        <w:t xml:space="preserve">with a recent distinction between</w:t>
+      </w:r>
+      <w:r>
+        <w:t xml:space="preserve"> </w:t>
+      </w:r>
+      <w:r>
+        <w:t xml:space="preserve">“thin”</w:t>
+      </w:r>
+      <w:r>
+        <w:t xml:space="preserve"> </w:t>
+      </w:r>
+      <w:r>
+        <w:t xml:space="preserve">and</w:t>
+      </w:r>
+      <w:r>
+        <w:t xml:space="preserve"> </w:t>
+      </w:r>
+      <w:r>
+        <w:t xml:space="preserve">“thick”</w:t>
+      </w:r>
+      <w:r>
+        <w:t xml:space="preserve"> </w:t>
+      </w:r>
+      <w:r>
+        <w:t xml:space="preserve">empathy</w:t>
+      </w:r>
+      <w:r>
+        <w:t xml:space="preserve"> </w:t>
+      </w:r>
+      <w:r>
+        <w:t xml:space="preserve">(Crockett, 2025)</w:t>
+      </w:r>
+      <w:r>
+        <w:t xml:space="preserve">. Thick empathy draws on one’s accumulated</w:t>
+      </w:r>
+      <w:r>
+        <w:t xml:space="preserve"> </w:t>
+      </w:r>
+      <w:r>
+        <w:t xml:space="preserve">experiences with a specific person or experience with what they are</w:t>
+      </w:r>
+      <w:r>
+        <w:t xml:space="preserve"> </w:t>
+      </w:r>
+      <w:r>
+        <w:t xml:space="preserve">going through, letting another grasp someone’s inner state in a way that</w:t>
+      </w:r>
+      <w:r>
+        <w:t xml:space="preserve"> </w:t>
+      </w:r>
+      <w:r>
+        <w:t xml:space="preserve">those without that shared history cannot. Emotional disclosure may</w:t>
+      </w:r>
+      <w:r>
+        <w:t xml:space="preserve"> </w:t>
+      </w:r>
+      <w:r>
+        <w:t xml:space="preserve">therefore be diagnostic of closeness because revealing a sad emotion</w:t>
+      </w:r>
+      <w:r>
+        <w:t xml:space="preserve"> </w:t>
+      </w:r>
+      <w:r>
+        <w:t xml:space="preserve">invites thick empathy, the understanding and support that a close</w:t>
+      </w:r>
+      <w:r>
+        <w:t xml:space="preserve"> </w:t>
+      </w:r>
+      <w:r>
+        <w:t xml:space="preserve">partner is positioned to provide.</w:t>
       </w:r>
     </w:p>
     <w:p>
@@ -6748,7 +6802,7 @@
         <w:pStyle w:val="BodyText"/>
       </w:pPr>
       <w:r>
-        <w:t xml:space="preserve">This may be why neither adults nor children expected people to disclose</w:t>
+        <w:t xml:space="preserve">Relatedly, neither adults nor children expected people to disclose</w:t>
       </w:r>
       <w:r>
         <w:t xml:space="preserve"> </w:t>

</xml_diff>

<commit_message>
Add generative-AI use disclosure and tool citation
Co-Authored-By: Claude Opus 4.8 <noreply@anthropic.com>
</commit_message>
<xml_diff>
--- a/6. Writing & Presentations/OMIT_manuscript_rendered.docx
+++ b/6. Writing & Presentations/OMIT_manuscript_rendered.docx
@@ -2044,6 +2044,60 @@
       <w:r>
         <w:t xml:space="preserve">folder).</w:t>
       </w:r>
+      <w:r>
+        <w:t xml:space="preserve"> </w:t>
+      </w:r>
+      <w:r>
+        <w:t xml:space="preserve">In preparing this manuscript we used a generative AI assistant (Claude,</w:t>
+      </w:r>
+      <w:r>
+        <w:t xml:space="preserve"> </w:t>
+      </w:r>
+      <w:r>
+        <w:t xml:space="preserve">Opus 4.8)</w:t>
+      </w:r>
+      <w:r>
+        <w:t xml:space="preserve"> </w:t>
+      </w:r>
+      <w:r>
+        <w:t xml:space="preserve">(Anthropic, 2026)</w:t>
+      </w:r>
+      <w:r>
+        <w:t xml:space="preserve"> </w:t>
+      </w:r>
+      <w:r>
+        <w:t xml:space="preserve">to assist with drafting and editing</w:t>
+      </w:r>
+      <w:r>
+        <w:t xml:space="preserve"> </w:t>
+      </w:r>
+      <w:r>
+        <w:t xml:space="preserve">prose, formatting the manuscript, and writing and organizing the analysis</w:t>
+      </w:r>
+      <w:r>
+        <w:t xml:space="preserve"> </w:t>
+      </w:r>
+      <w:r>
+        <w:t xml:space="preserve">code and figures. The authors reviewed, verified, and edited all</w:t>
+      </w:r>
+      <w:r>
+        <w:t xml:space="preserve"> </w:t>
+      </w:r>
+      <w:r>
+        <w:t xml:space="preserve">AI-assisted output and take full responsibility for the content of the</w:t>
+      </w:r>
+      <w:r>
+        <w:t xml:space="preserve"> </w:t>
+      </w:r>
+      <w:r>
+        <w:t xml:space="preserve">manuscript; generative AI was not used to collect, generate, or fabricate</w:t>
+      </w:r>
+      <w:r>
+        <w:t xml:space="preserve"> </w:t>
+      </w:r>
+      <w:r>
+        <w:t xml:space="preserve">data or results.</w:t>
+      </w:r>
     </w:p>
     <w:bookmarkEnd w:id="20"/>
     <w:bookmarkEnd w:id="21"/>
@@ -7575,7 +7629,7 @@
       </w:r>
     </w:p>
     <w:bookmarkEnd w:id="64"/>
-    <w:bookmarkStart w:id="116" w:name="references"/>
+    <w:bookmarkStart w:id="118" w:name="references"/>
     <w:p>
       <w:pPr>
         <w:pStyle w:val="Heading1"/>
@@ -7584,7 +7638,7 @@
         <w:t xml:space="preserve">References</w:t>
       </w:r>
     </w:p>
-    <w:bookmarkStart w:id="115" w:name="refs"/>
+    <w:bookmarkStart w:id="117" w:name="refs"/>
     <w:bookmarkStart w:id="66" w:name="ref-afshordi2021"/>
     <w:p>
       <w:pPr>
@@ -7679,7 +7733,44 @@
       </w:hyperlink>
     </w:p>
     <w:bookmarkEnd w:id="68"/>
-    <w:bookmarkStart w:id="70" w:name="ref-appelbaum2018jars"/>
+    <w:bookmarkStart w:id="70" w:name="ref-anthropic2026claude"/>
+    <w:p>
+      <w:pPr>
+        <w:pStyle w:val="Bibliography"/>
+      </w:pPr>
+      <w:r>
+        <w:t xml:space="preserve">Anthropic. (2026).</w:t>
+      </w:r>
+      <w:r>
+        <w:t xml:space="preserve"> </w:t>
+      </w:r>
+      <w:r>
+        <w:rPr>
+          <w:i/>
+          <w:iCs/>
+        </w:rPr>
+        <w:t xml:space="preserve">Claude (opus 4.8)</w:t>
+      </w:r>
+      <w:r>
+        <w:t xml:space="preserve">.</w:t>
+      </w:r>
+      <w:r>
+        <w:t xml:space="preserve"> </w:t>
+      </w:r>
+      <w:hyperlink r:id="rId69">
+        <w:r>
+          <w:rPr>
+            <w:rStyle w:val="Hyperlink"/>
+          </w:rPr>
+          <w:t xml:space="preserve">https://claude.ai</w:t>
+        </w:r>
+      </w:hyperlink>
+      <w:r>
+        <w:t xml:space="preserve">.</w:t>
+      </w:r>
+    </w:p>
+    <w:bookmarkEnd w:id="70"/>
+    <w:bookmarkStart w:id="72" w:name="ref-appelbaum2018jars"/>
     <w:p>
       <w:pPr>
         <w:pStyle w:val="Bibliography"/>
@@ -7728,7 +7819,7 @@
       <w:r>
         <w:t xml:space="preserve"> </w:t>
       </w:r>
-      <w:hyperlink r:id="rId69">
+      <w:hyperlink r:id="rId71">
         <w:r>
           <w:rPr>
             <w:rStyle w:val="Hyperlink"/>
@@ -7737,8 +7828,8 @@
         </w:r>
       </w:hyperlink>
     </w:p>
-    <w:bookmarkEnd w:id="70"/>
-    <w:bookmarkStart w:id="72" w:name="ref-burke2022"/>
+    <w:bookmarkEnd w:id="72"/>
+    <w:bookmarkStart w:id="74" w:name="ref-burke2022"/>
     <w:p>
       <w:pPr>
         <w:pStyle w:val="Bibliography"/>
@@ -7775,7 +7866,7 @@
       <w:r>
         <w:t xml:space="preserve"> </w:t>
       </w:r>
-      <w:hyperlink r:id="rId71">
+      <w:hyperlink r:id="rId73">
         <w:r>
           <w:rPr>
             <w:rStyle w:val="Hyperlink"/>
@@ -7784,8 +7875,8 @@
         </w:r>
       </w:hyperlink>
     </w:p>
-    <w:bookmarkEnd w:id="72"/>
-    <w:bookmarkStart w:id="74" w:name="ref-burkner2018brms"/>
+    <w:bookmarkEnd w:id="74"/>
+    <w:bookmarkStart w:id="76" w:name="ref-burkner2018brms"/>
     <w:p>
       <w:pPr>
         <w:pStyle w:val="Bibliography"/>
@@ -7822,7 +7913,7 @@
       <w:r>
         <w:t xml:space="preserve"> </w:t>
       </w:r>
-      <w:hyperlink r:id="rId73">
+      <w:hyperlink r:id="rId75">
         <w:r>
           <w:rPr>
             <w:rStyle w:val="Hyperlink"/>
@@ -7831,8 +7922,8 @@
         </w:r>
       </w:hyperlink>
     </w:p>
-    <w:bookmarkEnd w:id="74"/>
-    <w:bookmarkStart w:id="75" w:name="ref-chelune1984"/>
+    <w:bookmarkEnd w:id="76"/>
+    <w:bookmarkStart w:id="77" w:name="ref-chelune1984"/>
     <w:p>
       <w:pPr>
         <w:pStyle w:val="Bibliography"/>
@@ -7867,8 +7958,8 @@
         <w:t xml:space="preserve">(1), 213.</w:t>
       </w:r>
     </w:p>
-    <w:bookmarkEnd w:id="75"/>
-    <w:bookmarkStart w:id="77" w:name="ref-clark1979"/>
+    <w:bookmarkEnd w:id="77"/>
+    <w:bookmarkStart w:id="79" w:name="ref-clark1979"/>
     <w:p>
       <w:pPr>
         <w:pStyle w:val="Bibliography"/>
@@ -7905,7 +7996,7 @@
       <w:r>
         <w:t xml:space="preserve"> </w:t>
       </w:r>
-      <w:hyperlink r:id="rId76">
+      <w:hyperlink r:id="rId78">
         <w:r>
           <w:rPr>
             <w:rStyle w:val="Hyperlink"/>
@@ -7914,8 +8005,8 @@
         </w:r>
       </w:hyperlink>
     </w:p>
-    <w:bookmarkEnd w:id="77"/>
-    <w:bookmarkStart w:id="78" w:name="ref-crockett2025empathy"/>
+    <w:bookmarkEnd w:id="79"/>
+    <w:bookmarkStart w:id="80" w:name="ref-crockett2025empathy"/>
     <w:p>
       <w:pPr>
         <w:pStyle w:val="Bibliography"/>
@@ -7937,8 +8028,8 @@
         <w:t xml:space="preserve">.</w:t>
       </w:r>
     </w:p>
-    <w:bookmarkEnd w:id="78"/>
-    <w:bookmarkStart w:id="80" w:name="ref-derlega2008"/>
+    <w:bookmarkEnd w:id="80"/>
+    <w:bookmarkStart w:id="82" w:name="ref-derlega2008"/>
     <w:p>
       <w:pPr>
         <w:pStyle w:val="Bibliography"/>
@@ -7975,7 +8066,7 @@
       <w:r>
         <w:t xml:space="preserve"> </w:t>
       </w:r>
-      <w:hyperlink r:id="rId79">
+      <w:hyperlink r:id="rId81">
         <w:r>
           <w:rPr>
             <w:rStyle w:val="Hyperlink"/>
@@ -7984,8 +8075,8 @@
         </w:r>
       </w:hyperlink>
     </w:p>
-    <w:bookmarkEnd w:id="80"/>
-    <w:bookmarkStart w:id="81" w:name="ref-finkenauer2015know"/>
+    <w:bookmarkEnd w:id="82"/>
+    <w:bookmarkStart w:id="83" w:name="ref-finkenauer2015know"/>
     <w:p>
       <w:pPr>
         <w:pStyle w:val="Bibliography"/>
@@ -8020,8 +8111,8 @@
         <w:t xml:space="preserve">(1), 109–118.</w:t>
       </w:r>
     </w:p>
-    <w:bookmarkEnd w:id="81"/>
-    <w:bookmarkStart w:id="83" w:name="ref-fiske1992"/>
+    <w:bookmarkEnd w:id="83"/>
+    <w:bookmarkStart w:id="85" w:name="ref-fiske1992"/>
     <w:p>
       <w:pPr>
         <w:pStyle w:val="Bibliography"/>
@@ -8058,7 +8149,7 @@
       <w:r>
         <w:t xml:space="preserve"> </w:t>
       </w:r>
-      <w:hyperlink r:id="rId82">
+      <w:hyperlink r:id="rId84">
         <w:r>
           <w:rPr>
             <w:rStyle w:val="Hyperlink"/>
@@ -8067,8 +8158,8 @@
         </w:r>
       </w:hyperlink>
     </w:p>
-    <w:bookmarkEnd w:id="83"/>
-    <w:bookmarkStart w:id="85" w:name="ref-liberman2018"/>
+    <w:bookmarkEnd w:id="85"/>
+    <w:bookmarkStart w:id="87" w:name="ref-liberman2018"/>
     <w:p>
       <w:pPr>
         <w:pStyle w:val="Bibliography"/>
@@ -8105,7 +8196,7 @@
       <w:r>
         <w:t xml:space="preserve"> </w:t>
       </w:r>
-      <w:hyperlink r:id="rId84">
+      <w:hyperlink r:id="rId86">
         <w:r>
           <w:rPr>
             <w:rStyle w:val="Hyperlink"/>
@@ -8114,8 +8205,8 @@
         </w:r>
       </w:hyperlink>
     </w:p>
-    <w:bookmarkEnd w:id="85"/>
-    <w:bookmarkStart w:id="86" w:name="ref-powell2022adopted"/>
+    <w:bookmarkEnd w:id="87"/>
+    <w:bookmarkStart w:id="88" w:name="ref-powell2022adopted"/>
     <w:p>
       <w:pPr>
         <w:pStyle w:val="Bibliography"/>
@@ -8150,8 +8241,8 @@
         <w:t xml:space="preserve">(5), 1215–1233.</w:t>
       </w:r>
     </w:p>
-    <w:bookmarkEnd w:id="86"/>
-    <w:bookmarkStart w:id="88" w:name="ref-rcoreteam2025"/>
+    <w:bookmarkEnd w:id="88"/>
+    <w:bookmarkStart w:id="90" w:name="ref-rcoreteam2025"/>
     <w:p>
       <w:pPr>
         <w:pStyle w:val="Bibliography"/>
@@ -8175,7 +8266,7 @@
       <w:r>
         <w:t xml:space="preserve"> </w:t>
       </w:r>
-      <w:hyperlink r:id="rId87">
+      <w:hyperlink r:id="rId89">
         <w:r>
           <w:rPr>
             <w:rStyle w:val="Hyperlink"/>
@@ -8184,8 +8275,8 @@
         </w:r>
       </w:hyperlink>
     </w:p>
-    <w:bookmarkEnd w:id="88"/>
-    <w:bookmarkStart w:id="90" w:name="ref-rumsey2013opacity"/>
+    <w:bookmarkEnd w:id="90"/>
+    <w:bookmarkStart w:id="92" w:name="ref-rumsey2013opacity"/>
     <w:p>
       <w:pPr>
         <w:pStyle w:val="Bibliography"/>
@@ -8222,7 +8313,7 @@
       <w:r>
         <w:t xml:space="preserve"> </w:t>
       </w:r>
-      <w:hyperlink r:id="rId89">
+      <w:hyperlink r:id="rId91">
         <w:r>
           <w:rPr>
             <w:rStyle w:val="Hyperlink"/>
@@ -8231,8 +8322,8 @@
         </w:r>
       </w:hyperlink>
     </w:p>
-    <w:bookmarkEnd w:id="90"/>
-    <w:bookmarkStart w:id="92" w:name="ref-scott2017lookit"/>
+    <w:bookmarkEnd w:id="92"/>
+    <w:bookmarkStart w:id="94" w:name="ref-scott2017lookit"/>
     <w:p>
       <w:pPr>
         <w:pStyle w:val="Bibliography"/>
@@ -8269,7 +8360,7 @@
       <w:r>
         <w:t xml:space="preserve"> </w:t>
       </w:r>
-      <w:hyperlink r:id="rId91">
+      <w:hyperlink r:id="rId93">
         <w:r>
           <w:rPr>
             <w:rStyle w:val="Hyperlink"/>
@@ -8278,8 +8369,8 @@
         </w:r>
       </w:hyperlink>
     </w:p>
-    <w:bookmarkEnd w:id="92"/>
-    <w:bookmarkStart w:id="94" w:name="ref-shields2024"/>
+    <w:bookmarkEnd w:id="94"/>
+    <w:bookmarkStart w:id="96" w:name="ref-shields2024"/>
     <w:p>
       <w:pPr>
         <w:pStyle w:val="Bibliography"/>
@@ -8316,7 +8407,7 @@
       <w:r>
         <w:t xml:space="preserve"> </w:t>
       </w:r>
-      <w:hyperlink r:id="rId93">
+      <w:hyperlink r:id="rId95">
         <w:r>
           <w:rPr>
             <w:rStyle w:val="Hyperlink"/>
@@ -8325,8 +8416,8 @@
         </w:r>
       </w:hyperlink>
     </w:p>
-    <w:bookmarkEnd w:id="94"/>
-    <w:bookmarkStart w:id="96" w:name="ref-shutts2021"/>
+    <w:bookmarkEnd w:id="96"/>
+    <w:bookmarkStart w:id="98" w:name="ref-shutts2021"/>
     <w:p>
       <w:pPr>
         <w:pStyle w:val="Bibliography"/>
@@ -8353,7 +8444,7 @@
       <w:r>
         <w:t xml:space="preserve"> </w:t>
       </w:r>
-      <w:hyperlink r:id="rId95">
+      <w:hyperlink r:id="rId97">
         <w:r>
           <w:rPr>
             <w:rStyle w:val="Hyperlink"/>
@@ -8362,8 +8453,8 @@
         </w:r>
       </w:hyperlink>
     </w:p>
-    <w:bookmarkEnd w:id="96"/>
-    <w:bookmarkStart w:id="97" w:name="ref-simmel1906sociology"/>
+    <w:bookmarkEnd w:id="98"/>
+    <w:bookmarkStart w:id="99" w:name="ref-simmel1906sociology"/>
     <w:p>
       <w:pPr>
         <w:pStyle w:val="Bibliography"/>
@@ -8398,8 +8489,8 @@
         <w:t xml:space="preserve">(4), 441–498.</w:t>
       </w:r>
     </w:p>
-    <w:bookmarkEnd w:id="97"/>
-    <w:bookmarkStart w:id="99" w:name="ref-small2017"/>
+    <w:bookmarkEnd w:id="99"/>
+    <w:bookmarkStart w:id="101" w:name="ref-small2017"/>
     <w:p>
       <w:pPr>
         <w:pStyle w:val="Bibliography"/>
@@ -8426,7 +8517,7 @@
       <w:r>
         <w:t xml:space="preserve"> </w:t>
       </w:r>
-      <w:hyperlink r:id="rId98">
+      <w:hyperlink r:id="rId100">
         <w:r>
           <w:rPr>
             <w:rStyle w:val="Hyperlink"/>
@@ -8435,8 +8526,8 @@
         </w:r>
       </w:hyperlink>
     </w:p>
-    <w:bookmarkEnd w:id="99"/>
-    <w:bookmarkStart w:id="101" w:name="ref-spokes2016"/>
+    <w:bookmarkEnd w:id="101"/>
+    <w:bookmarkStart w:id="103" w:name="ref-spokes2016"/>
     <w:p>
       <w:pPr>
         <w:pStyle w:val="Bibliography"/>
@@ -8473,7 +8564,7 @@
       <w:r>
         <w:t xml:space="preserve"> </w:t>
       </w:r>
-      <w:hyperlink r:id="rId100">
+      <w:hyperlink r:id="rId102">
         <w:r>
           <w:rPr>
             <w:rStyle w:val="Hyperlink"/>
@@ -8482,8 +8573,8 @@
         </w:r>
       </w:hyperlink>
     </w:p>
-    <w:bookmarkEnd w:id="101"/>
-    <w:bookmarkStart w:id="103" w:name="ref-thomas2024"/>
+    <w:bookmarkEnd w:id="103"/>
+    <w:bookmarkStart w:id="105" w:name="ref-thomas2024"/>
     <w:p>
       <w:pPr>
         <w:pStyle w:val="Bibliography"/>
@@ -8507,7 +8598,7 @@
       <w:r>
         <w:t xml:space="preserve"> </w:t>
       </w:r>
-      <w:hyperlink r:id="rId102">
+      <w:hyperlink r:id="rId104">
         <w:r>
           <w:rPr>
             <w:rStyle w:val="Hyperlink"/>
@@ -8516,8 +8607,8 @@
         </w:r>
       </w:hyperlink>
     </w:p>
-    <w:bookmarkEnd w:id="103"/>
-    <w:bookmarkStart w:id="104" w:name="ref-thomas2025caregiving"/>
+    <w:bookmarkEnd w:id="105"/>
+    <w:bookmarkStart w:id="106" w:name="ref-thomas2025caregiving"/>
     <w:p>
       <w:pPr>
         <w:pStyle w:val="Bibliography"/>
@@ -8552,8 +8643,8 @@
         <w:t xml:space="preserve">(1), 14–35.</w:t>
       </w:r>
     </w:p>
-    <w:bookmarkEnd w:id="104"/>
-    <w:bookmarkStart w:id="106" w:name="ref-thomasSaliva2022"/>
+    <w:bookmarkEnd w:id="106"/>
+    <w:bookmarkStart w:id="108" w:name="ref-thomasSaliva2022"/>
     <w:p>
       <w:pPr>
         <w:pStyle w:val="Bibliography"/>
@@ -8590,7 +8681,7 @@
       <w:r>
         <w:t xml:space="preserve"> </w:t>
       </w:r>
-      <w:hyperlink r:id="rId105">
+      <w:hyperlink r:id="rId107">
         <w:r>
           <w:rPr>
             <w:rStyle w:val="Hyperlink"/>
@@ -8599,8 +8690,8 @@
         </w:r>
       </w:hyperlink>
     </w:p>
-    <w:bookmarkEnd w:id="106"/>
-    <w:bookmarkStart w:id="108" w:name="ref-thomsen2020"/>
+    <w:bookmarkEnd w:id="108"/>
+    <w:bookmarkStart w:id="110" w:name="ref-thomsen2020"/>
     <w:p>
       <w:pPr>
         <w:pStyle w:val="Bibliography"/>
@@ -8637,7 +8728,7 @@
       <w:r>
         <w:t xml:space="preserve"> </w:t>
       </w:r>
-      <w:hyperlink r:id="rId107">
+      <w:hyperlink r:id="rId109">
         <w:r>
           <w:rPr>
             <w:rStyle w:val="Hyperlink"/>
@@ -8646,8 +8737,8 @@
         </w:r>
       </w:hyperlink>
     </w:p>
-    <w:bookmarkEnd w:id="108"/>
-    <w:bookmarkStart w:id="110" w:name="ref-vijayakumar2020"/>
+    <w:bookmarkEnd w:id="110"/>
+    <w:bookmarkStart w:id="112" w:name="ref-vijayakumar2020"/>
     <w:p>
       <w:pPr>
         <w:pStyle w:val="Bibliography"/>
@@ -8684,7 +8775,7 @@
       <w:r>
         <w:t xml:space="preserve"> </w:t>
       </w:r>
-      <w:hyperlink r:id="rId109">
+      <w:hyperlink r:id="rId111">
         <w:r>
           <w:rPr>
             <w:rStyle w:val="Hyperlink"/>
@@ -8693,8 +8784,8 @@
         </w:r>
       </w:hyperlink>
     </w:p>
-    <w:bookmarkEnd w:id="110"/>
-    <w:bookmarkStart w:id="111" w:name="ref-wellman2015"/>
+    <w:bookmarkEnd w:id="112"/>
+    <w:bookmarkStart w:id="113" w:name="ref-wellman2015"/>
     <w:p>
       <w:pPr>
         <w:pStyle w:val="Bibliography"/>
@@ -8716,8 +8807,8 @@
         <w:t xml:space="preserve">. Oxford University Press.</w:t>
       </w:r>
     </w:p>
-    <w:bookmarkEnd w:id="111"/>
-    <w:bookmarkStart w:id="112" w:name="ref-willems2020role"/>
+    <w:bookmarkEnd w:id="113"/>
+    <w:bookmarkStart w:id="114" w:name="ref-willems2020role"/>
     <w:p>
       <w:pPr>
         <w:pStyle w:val="Bibliography"/>
@@ -8752,8 +8843,8 @@
         <w:t xml:space="preserve">, 33–37.</w:t>
       </w:r>
     </w:p>
-    <w:bookmarkEnd w:id="112"/>
-    <w:bookmarkStart w:id="114" w:name="ref-woo2024"/>
+    <w:bookmarkEnd w:id="114"/>
+    <w:bookmarkStart w:id="116" w:name="ref-woo2024"/>
     <w:p>
       <w:pPr>
         <w:pStyle w:val="Bibliography"/>
@@ -8790,7 +8881,7 @@
       <w:r>
         <w:t xml:space="preserve"> </w:t>
       </w:r>
-      <w:hyperlink r:id="rId113">
+      <w:hyperlink r:id="rId115">
         <w:r>
           <w:rPr>
             <w:rStyle w:val="Hyperlink"/>
@@ -8799,9 +8890,9 @@
         </w:r>
       </w:hyperlink>
     </w:p>
-    <w:bookmarkEnd w:id="114"/>
-    <w:bookmarkEnd w:id="115"/>
     <w:bookmarkEnd w:id="116"/>
+    <w:bookmarkEnd w:id="117"/>
+    <w:bookmarkEnd w:id="118"/>
     <w:sectPr>
       <w:footnotePr>
         <w:numRestart w:val="eachSect"/>

</xml_diff>